<commit_message>
Update the Direct mismatch report after the evening corrections.
Co-authored-by: Igor-Lark <Igor-Lark@users.noreply.github.com>
</commit_message>
<xml_diff>
--- a/cursor/Nestykovki_Direct_RB_Popaj_2026-10-30.docx
+++ b/cursor/Nestykovki_Direct_RB_Popaj_2026-10-30.docx
@@ -18,17 +18,93 @@
           <w:b w:val="0"/>
           <w:sz w:val="22"/>
         </w:rPr>
-        <w:t>Кампания ЕПК «Групповая рыбалка», № 713632237. Сайт boat-sochi.ru/gruppovaja_ribalka. Сводка на 30 октября 2026, 22:00 мск.</w:t>
+        <w:t>Кампания ЕПК «Групповая рыбалка», № 713632237. Страница boat-sochi.ru/gruppovaja_ribalka проверена 30 октября 2026, около 22:40 мск. Лимиты Директа в этот список не входят: тексты и заголовки сервис принимает.</w:t>
       </w:r>
     </w:p>
     <w:p>
+      <w:pPr>
+        <w:pStyle w:val="Heading1"/>
+      </w:pPr>
+      <w:r>
+        <w:t>Что уже поправлено</w:t>
+      </w:r>
+    </w:p>
+    <w:p>
+      <w:pPr>
+        <w:pStyle w:val="ListBullet"/>
+        <w:spacing w:after="60"/>
+      </w:pPr>
       <w:r>
         <w:rPr>
           <w:rFonts w:ascii="Calibri" w:hAnsi="Calibri"/>
-          <w:b w:val="0"/>
           <w:sz w:val="22"/>
         </w:rPr>
-        <w:t>В документ вошло всё, что разошлось между сайтом, кампанией и группами G1–G3, G5, G9 и G10. Бюджет, цены целей и места показа, пока стратегия учится, сюда не включены: их лучше не менять.</w:t>
+        <w:t>На странице сезон ноябрь–декабрь: ставрида, кефаль, сарган. Барабули в этом абзаце нет. Быстрая ссылка G5 говорит то же.</w:t>
+      </w:r>
+    </w:p>
+    <w:p>
+      <w:pPr>
+        <w:pStyle w:val="ListBullet"/>
+        <w:spacing w:after="60"/>
+      </w:pPr>
+      <w:r>
+        <w:rPr>
+          <w:rFonts w:ascii="Calibri" w:hAnsi="Calibri"/>
+          <w:sz w:val="22"/>
+        </w:rPr>
+        <w:t>В заголовках G5 нет пеламиды и октября. Есть ноябрь, ставрида, кефаль и сарган.</w:t>
+      </w:r>
+    </w:p>
+    <w:p>
+      <w:pPr>
+        <w:pStyle w:val="ListBullet"/>
+        <w:spacing w:after="60"/>
+      </w:pPr>
+      <w:r>
+        <w:rPr>
+          <w:rFonts w:ascii="Calibri" w:hAnsi="Calibri"/>
+          <w:sz w:val="22"/>
+        </w:rPr>
+        <w:t>Из G9 убран минус «-рыбалка». Группа снова может показываться по своим ключам.</w:t>
+      </w:r>
+    </w:p>
+    <w:p>
+      <w:pPr>
+        <w:pStyle w:val="ListBullet"/>
+        <w:spacing w:after="60"/>
+      </w:pPr>
+      <w:r>
+        <w:rPr>
+          <w:rFonts w:ascii="Calibri" w:hAnsi="Calibri"/>
+          <w:sz w:val="22"/>
+        </w:rPr>
+        <w:t>В минусах кампании появились «-корабль» и «-лазаревск». «-инструктор» снят.</w:t>
+      </w:r>
+    </w:p>
+    <w:p>
+      <w:pPr>
+        <w:pStyle w:val="ListBullet"/>
+        <w:spacing w:after="60"/>
+      </w:pPr>
+      <w:r>
+        <w:rPr>
+          <w:rFonts w:ascii="Calibri" w:hAnsi="Calibri"/>
+          <w:sz w:val="22"/>
+        </w:rPr>
+        <w:t>Из G10 убраны мёртвые ключи Дагомыса и Лоо, ключ про камбалу и повтор «рыбалка в открытом море сочи».</w:t>
+      </w:r>
+    </w:p>
+    <w:p>
+      <w:pPr>
+        <w:pStyle w:val="ListBullet"/>
+        <w:spacing w:after="60"/>
+      </w:pPr>
+      <w:r>
+        <w:rPr>
+          <w:rFonts w:ascii="Calibri" w:hAnsi="Calibri"/>
+          <w:sz w:val="22"/>
+        </w:rPr>
+        <w:t>Из G1–G3 убран ключ «морская рыбалка сириус -порт -групповой -катер».</w:t>
       </w:r>
     </w:p>
     <w:p>
@@ -50,14 +126,14 @@
           <w:b/>
           <w:sz w:val="22"/>
         </w:rPr>
-        <w:t>G9 не показывается.</w:t>
+        <w:t>Расписание.</w:t>
       </w:r>
       <w:r>
         <w:rPr>
           <w:rFonts w:ascii="Calibri" w:hAnsi="Calibri"/>
           <w:sz w:val="22"/>
         </w:rPr>
-        <w:t xml:space="preserve"> Минус -рыбалка в G9 гасит 17 ключей из 20. Запросы «трофейная рыбалка» и «рыбалка на ската» не берёт ни одна группа: в G1–G3 и G5 они закрыты своими минусами.</w:t>
+        <w:t xml:space="preserve"> В объявлениях два выхода, 12:00 и 15:00. На странице по-прежнему три: 9:00, 12:00 и 15:00. Рядом написано «уточняйте, бывают изменения», но девять утра на странице стоит.</w:t>
       </w:r>
     </w:p>
     <w:p>
@@ -71,14 +147,14 @@
           <w:b/>
           <w:sz w:val="22"/>
         </w:rPr>
-        <w:t>G5 врёт про сезон.</w:t>
+        <w:t>Два телефона.</w:t>
       </w:r>
       <w:r>
         <w:rPr>
           <w:rFonts w:ascii="Calibri" w:hAnsi="Calibri"/>
           <w:sz w:val="22"/>
         </w:rPr>
-        <w:t xml:space="preserve"> Три заголовка обещают пеламиду, один ещё и октябрь. Ход пеламиды к 30 октября закончился. Директ подставляет любой заголовок к любому ключу группы, в том числе к «какая рыба ловится сочи ноябрь».</w:t>
+        <w:t xml:space="preserve"> Кнопка в шапке сайта и ссылка «Забронировать» ведут на +7 918 304-40-00. Внизу страницы и в карточке организации, откуда Директ берёт звонок и Карты, номер +7 917 675-05-55.</w:t>
       </w:r>
     </w:p>
     <w:p>
@@ -92,14 +168,14 @@
           <w:b/>
           <w:sz w:val="22"/>
         </w:rPr>
-        <w:t>Тексты не входят в лимит.</w:t>
+        <w:t>Яхта уходит в групповой билет.</w:t>
       </w:r>
       <w:r>
         <w:rPr>
           <w:rFonts w:ascii="Calibri" w:hAnsi="Calibri"/>
           <w:sz w:val="22"/>
         </w:rPr>
-        <w:t xml:space="preserve"> Один и тот же текст «Не бронируйте весь катер…» стоит в G1–G3, G5 и G10 и весит 84 знака при лимите 81. Все три текста G9 тоже длиннее лимита: 85, 85 и 82. Директ их не сохранит.</w:t>
+        <w:t xml:space="preserve"> Запрос «рыбалка с яхты сочи» ловит G10 и показывает групповой катамаран за 2 800 ₽. В G1–G3, G5 и G9 стоит минус «-яхты», поэтому трофей и остальные группы этот запрос не берут.</w:t>
       </w:r>
     </w:p>
     <w:p>
@@ -113,14 +189,14 @@
           <w:b/>
           <w:sz w:val="22"/>
         </w:rPr>
-        <w:t>Страница отстаёт от объявлений.</w:t>
+        <w:t>Сезон не виден туристам.</w:t>
       </w:r>
       <w:r>
         <w:rPr>
           <w:rFonts w:ascii="Calibri" w:hAnsi="Calibri"/>
           <w:sz w:val="22"/>
         </w:rPr>
-        <w:t xml:space="preserve"> В объявлениях два выхода, 12:00 и 15:00. На странице до сих пор три: 9:00, 12:00 и 15:00. Сезон в быстрой ссылке кампании уже ноябрь–декабрь (ставрида, кефаль, сарган), на странице всё ещё октябрь–ноябрь и барабуля.</w:t>
+        <w:t xml:space="preserve"> Ключи ставриды, кефали и саргана лежат в G5, а география G5 только Краснодарский край. Запрос из Москвы «рыбалка на ставриду сочи» в ключ не попадает и может прийти лишь широким автотаргетингом G1–G3.</w:t>
       </w:r>
     </w:p>
     <w:p>
@@ -134,14 +210,14 @@
           <w:b/>
           <w:sz w:val="22"/>
         </w:rPr>
-        <w:t>Два телефона и два адреса.</w:t>
+        <w:t>Время клёва и слоты.</w:t>
       </w:r>
       <w:r>
         <w:rPr>
           <w:rFonts w:ascii="Calibri" w:hAnsi="Calibri"/>
           <w:sz w:val="22"/>
         </w:rPr>
-        <w:t xml:space="preserve"> Кнопка звонка в объявлении и в Картах набирает +7 917 675-05-55, организация «Яхты Сириуса», Голубая, 1. Красная кнопка сайта и ссылка «Забронировать» ведут на +7 918 304-40-00. Выход при этом с Парусной, 1, линия 2, Имеретинский порт.</w:t>
+        <w:t xml:space="preserve"> На карточке ставриды на сайте лучшее время клёва указано как раннее утро или вечер. Рабочие слоты объявления дневные: 12:00 и 15:00.</w:t>
       </w:r>
     </w:p>
     <w:p>
@@ -149,7 +225,7 @@
         <w:pStyle w:val="Heading1"/>
       </w:pPr>
       <w:r>
-        <w:t>Сайт и карточка кампании</w:t>
+        <w:t>Сайт и адреса</w:t>
       </w:r>
     </w:p>
     <w:p>
@@ -159,7 +235,7 @@
           <w:b w:val="0"/>
           <w:sz w:val="22"/>
         </w:rPr>
-        <w:t>Цена 2 800 ₽, 3 часа, до 8 человек, снасти, готовка улова и трофей от 20 000 ₽ сходятся и на сайте, и в объявлениях. Ниже только расхождения.</w:t>
+        <w:t>Цена 2 800 ₽, 3 часа, до 8 человек, снасти, готовка улова и трофей от 20 000 ₽ сходятся со ссылками. Адрес внизу страницы: улица Голубая, 1, Имеретинский порт, линия 2. Улицы Парусная на странице нет.</w:t>
       </w:r>
     </w:p>
     <w:tbl>
@@ -202,7 +278,7 @@
                 <w:b/>
                 <w:sz w:val="20"/>
               </w:rPr>
-              <w:t>Сейчас</w:t>
+              <w:t>Что написано</w:t>
             </w:r>
           </w:p>
         </w:tc>
@@ -218,7 +294,7 @@
                 <w:b/>
                 <w:sz w:val="20"/>
               </w:rPr>
-              <w:t>Как должно быть</w:t>
+              <w:t>С чем расходится</w:t>
             </w:r>
           </w:p>
         </w:tc>
@@ -235,7 +311,7 @@
                 <w:rFonts w:ascii="Calibri" w:hAnsi="Calibri"/>
                 <w:sz w:val="20"/>
               </w:rPr>
-              <w:t>Слоты</w:t>
+              <w:t>Страница, блок выхода</w:t>
             </w:r>
           </w:p>
         </w:tc>
@@ -250,7 +326,7 @@
                 <w:rFonts w:ascii="Calibri" w:hAnsi="Calibri"/>
                 <w:sz w:val="20"/>
               </w:rPr>
-              <w:t>Сайт: 9:00, 12:00 и 15:00</w:t>
+              <w:t>9:00, 12:00 и 15:00</w:t>
             </w:r>
           </w:p>
         </w:tc>
@@ -265,7 +341,7 @@
                 <w:rFonts w:ascii="Calibri" w:hAnsi="Calibri"/>
                 <w:sz w:val="20"/>
               </w:rPr>
-              <w:t>12:00 и 15:00, как в объявлении</w:t>
+              <w:t>Объявления и ссылка G5: только 12:00 и 15:00</w:t>
             </w:r>
           </w:p>
         </w:tc>
@@ -282,7 +358,7 @@
                 <w:rFonts w:ascii="Calibri" w:hAnsi="Calibri"/>
                 <w:sz w:val="20"/>
               </w:rPr>
-              <w:t>Сезон на странице</w:t>
+              <w:t>Карточка ставриды</w:t>
             </w:r>
           </w:p>
         </w:tc>
@@ -297,7 +373,7 @@
                 <w:rFonts w:ascii="Calibri" w:hAnsi="Calibri"/>
                 <w:sz w:val="20"/>
               </w:rPr>
-              <w:t>Октябрь–ноябрь, в тексте барабуля</w:t>
+              <w:t>Лучший клёв рано утром или вечером</w:t>
             </w:r>
           </w:p>
         </w:tc>
@@ -312,7 +388,7 @@
                 <w:rFonts w:ascii="Calibri" w:hAnsi="Calibri"/>
                 <w:sz w:val="20"/>
               </w:rPr>
-              <w:t>Ноябрь–декабрь: ставрида, кефаль, сарган</w:t>
+              <w:t>Слоты 12:00 и 15:00</w:t>
             </w:r>
           </w:p>
         </w:tc>
@@ -329,54 +405,7 @@
                 <w:rFonts w:ascii="Calibri" w:hAnsi="Calibri"/>
                 <w:sz w:val="20"/>
               </w:rPr>
-              <w:t>Звонок из объявления и Карт</w:t>
-            </w:r>
-          </w:p>
-        </w:tc>
-        <w:tc>
-          <w:tcPr>
-            <w:tcW w:type="dxa" w:w="3324"/>
-          </w:tcPr>
-          <w:p>
-            <w:r/>
-            <w:r>
-              <w:rPr>
-                <w:rFonts w:ascii="Calibri" w:hAnsi="Calibri"/>
-                <w:sz w:val="20"/>
-              </w:rPr>
-              <w:t>+7 917 675-05-55</w:t>
-            </w:r>
-          </w:p>
-        </w:tc>
-        <w:tc>
-          <w:tcPr>
-            <w:tcW w:type="dxa" w:w="3324"/>
-          </w:tcPr>
-          <w:p>
-            <w:r/>
-            <w:r>
-              <w:rPr>
-                <w:rFonts w:ascii="Calibri" w:hAnsi="Calibri"/>
-                <w:sz w:val="20"/>
-              </w:rPr>
-              <w:t>Один номер на рыбалку</w:t>
-            </w:r>
-          </w:p>
-        </w:tc>
-      </w:tr>
-      <w:tr>
-        <w:tc>
-          <w:tcPr>
-            <w:tcW w:type="dxa" w:w="3324"/>
-          </w:tcPr>
-          <w:p>
-            <w:r/>
-            <w:r>
-              <w:rPr>
-                <w:rFonts w:ascii="Calibri" w:hAnsi="Calibri"/>
-                <w:sz w:val="20"/>
-              </w:rPr>
-              <w:t>Кнопка сайта и ссылка «Забронировать»</w:t>
+              <w:t>Шапка и ссылка «Забронировать»</w:t>
             </w:r>
           </w:p>
         </w:tc>
@@ -406,7 +435,7 @@
                 <w:rFonts w:ascii="Calibri" w:hAnsi="Calibri"/>
                 <w:sz w:val="20"/>
               </w:rPr>
-              <w:t>Тот же номер</w:t>
+              <w:t>Низ страницы и звонок из объявления: +7 917 675-05-55</w:t>
             </w:r>
           </w:p>
         </w:tc>
@@ -423,7 +452,7 @@
                 <w:rFonts w:ascii="Calibri" w:hAnsi="Calibri"/>
                 <w:sz w:val="20"/>
               </w:rPr>
-              <w:t>Карты и организация</w:t>
+              <w:t>Ссылка G5 «Причал»</w:t>
             </w:r>
           </w:p>
         </w:tc>
@@ -438,7 +467,7 @@
                 <w:rFonts w:ascii="Calibri" w:hAnsi="Calibri"/>
                 <w:sz w:val="20"/>
               </w:rPr>
-              <w:t>Голубая, 1, «Яхты Сириуса»</w:t>
+              <w:t>Имеретинский порт, Голубая, 1</w:t>
             </w:r>
           </w:p>
         </w:tc>
@@ -453,7 +482,7 @@
                 <w:rFonts w:ascii="Calibri" w:hAnsi="Calibri"/>
                 <w:sz w:val="20"/>
               </w:rPr>
-              <w:t>Офис может остаться, причал нужен в ссылке</w:t>
+              <w:t>Совпадает с низом страницы</w:t>
             </w:r>
           </w:p>
         </w:tc>
@@ -470,7 +499,7 @@
                 <w:rFonts w:ascii="Calibri" w:hAnsi="Calibri"/>
                 <w:sz w:val="20"/>
               </w:rPr>
-              <w:t>Причал выхода</w:t>
+              <w:t>Ссылки кампании для G1–G3 и G10</w:t>
             </w:r>
           </w:p>
         </w:tc>
@@ -485,7 +514,7 @@
                 <w:rFonts w:ascii="Calibri" w:hAnsi="Calibri"/>
                 <w:sz w:val="20"/>
               </w:rPr>
-              <w:t>Парусная, 1, линия 2</w:t>
+              <w:t>Раньше там была Парусная, 1</w:t>
             </w:r>
           </w:p>
         </w:tc>
@@ -500,7 +529,54 @@
                 <w:rFonts w:ascii="Calibri" w:hAnsi="Calibri"/>
                 <w:sz w:val="20"/>
               </w:rPr>
-              <w:t>Так и писать в ссылке «Причал»</w:t>
+              <w:t>Этой улицы на странице нет. Если ссылку кампании не меняли, в этих группах чужой адрес</w:t>
+            </w:r>
+          </w:p>
+        </w:tc>
+      </w:tr>
+      <w:tr>
+        <w:tc>
+          <w:tcPr>
+            <w:tcW w:type="dxa" w:w="3324"/>
+          </w:tcPr>
+          <w:p>
+            <w:r/>
+            <w:r>
+              <w:rPr>
+                <w:rFonts w:ascii="Calibri" w:hAnsi="Calibri"/>
+                <w:sz w:val="20"/>
+              </w:rPr>
+              <w:t>Карты</w:t>
+            </w:r>
+          </w:p>
+        </w:tc>
+        <w:tc>
+          <w:tcPr>
+            <w:tcW w:type="dxa" w:w="3324"/>
+          </w:tcPr>
+          <w:p>
+            <w:r/>
+            <w:r>
+              <w:rPr>
+                <w:rFonts w:ascii="Calibri" w:hAnsi="Calibri"/>
+                <w:sz w:val="20"/>
+              </w:rPr>
+              <w:t>Организация «Яхты Сириуса», Голубая, 1</w:t>
+            </w:r>
+          </w:p>
+        </w:tc>
+        <w:tc>
+          <w:tcPr>
+            <w:tcW w:type="dxa" w:w="3324"/>
+          </w:tcPr>
+          <w:p>
+            <w:r/>
+            <w:r>
+              <w:rPr>
+                <w:rFonts w:ascii="Calibri" w:hAnsi="Calibri"/>
+                <w:sz w:val="20"/>
+              </w:rPr>
+              <w:t>Человек из Карт попадает в офис, не к трапу. Причал назван в быстрой ссылке</w:t>
             </w:r>
           </w:p>
         </w:tc>
@@ -514,7 +590,7 @@
           <w:b w:val="0"/>
           <w:sz w:val="22"/>
         </w:rPr>
-        <w:t>Быстрые ссылки и уточнения кампании переопределены минимум в одной группе. G5 и G9 задают свои ссылки. G1–G3 и G10 берут кампанийные. Состав ссылок G5 вы присылали повторно тем же блоком заголовков, самих строк ссылок в переписке нет.</w:t>
+        <w:t>С 1 декабря по 30 апреля кефаль нельзя брать внутри Имеретинского порта и с оградительных молов. В море за линией порта можно. Ссылка про ноябрь–декабрь кефаль не запрещает, если ловят не в акватории порта.</w:t>
       </w:r>
     </w:p>
     <w:p>
@@ -532,17 +608,7 @@
           <w:b w:val="0"/>
           <w:sz w:val="22"/>
         </w:rPr>
-        <w:t>Список после вашей правки в целом рабочий: чужие города, река, берег, пирс, карп, форель, прогулки, Тиггер, KMV, цены 1800 и 2500. Запрещённые площадки тоже чистые: игры, биржи, мамба, IMO, погода, справочники. Щука закрыта словом «щук», это нормальная форма слова «щука».</w:t>
-      </w:r>
-    </w:p>
-    <w:p>
-      <w:r>
-        <w:rPr>
-          <w:rFonts w:ascii="Calibri" w:hAnsi="Calibri"/>
-          <w:b/>
-          <w:sz w:val="22"/>
-        </w:rPr>
-        <w:t>Дыры, которые остались:</w:t>
+        <w:t>«-корабль», «-лазаревск» рядом с «-лазаревское» и «-петербург» стоят правильно. «-инструктор» снят. Запрещённые площадки по-прежнему про игры, биржи и справочники, к рыбалке не относятся.</w:t>
       </w:r>
     </w:p>
     <w:p>
@@ -555,7 +621,7 @@
           <w:rFonts w:ascii="Calibri" w:hAnsi="Calibri"/>
           <w:sz w:val="22"/>
         </w:rPr>
-        <w:t xml:space="preserve"> Старое «-корабл» вы убрали, рабочее «-корабль» не добавили. Запросы про корабль кампания не режет.</w:t>
+        <w:t>«-купить» остался. Он режет «купить билет» и «купить тур на рыбалку». Если так и задумано, пусть стоит.</w:t>
       </w:r>
     </w:p>
     <w:p>
@@ -568,7 +634,7 @@
           <w:rFonts w:ascii="Calibri" w:hAnsi="Calibri"/>
           <w:sz w:val="22"/>
         </w:rPr>
-        <w:t xml:space="preserve"> Есть «-лазаревское» и нет «-лазаревск». Это разные слова, Директ одно другим не закрывает.</w:t>
+        <w:t>Нет отдельного «-кемер»: Турция закрыта, Кемер нет. Нет связки «-морской порт»: есть «морпорт сочи» и «сочинский порт».</w:t>
       </w:r>
     </w:p>
     <w:p>
@@ -581,46 +647,7 @@
           <w:rFonts w:ascii="Calibri" w:hAnsi="Calibri"/>
           <w:sz w:val="22"/>
         </w:rPr>
-        <w:t xml:space="preserve"> «-купить» по-прежнему режет «купить билет» и «купить тур на рыбалку». Вы его оставили. Если это осознанно, пусть стоит.</w:t>
-      </w:r>
-    </w:p>
-    <w:p>
-      <w:pPr>
-        <w:pStyle w:val="ListBullet"/>
-        <w:spacing w:after="60"/>
-      </w:pPr>
-      <w:r>
-        <w:rPr>
-          <w:rFonts w:ascii="Calibri" w:hAnsi="Calibri"/>
-          <w:sz w:val="22"/>
-        </w:rPr>
-        <w:t xml:space="preserve"> «-инструктор» режет «рыбалка с инструктором». На борту капитан, такой запрос ваш. Тоже оставлен вами.</w:t>
-      </w:r>
-    </w:p>
-    <w:p>
-      <w:pPr>
-        <w:pStyle w:val="ListBullet"/>
-        <w:spacing w:after="60"/>
-      </w:pPr>
-      <w:r>
-        <w:rPr>
-          <w:rFonts w:ascii="Calibri" w:hAnsi="Calibri"/>
-          <w:sz w:val="22"/>
-        </w:rPr>
-        <w:t xml:space="preserve"> Нет «-кемер»: Турция закрыта, Кемер отдельно нет. Нет связки «-морской порт»: есть «морпорт сочи» и «сочинский порт», голый «морской порт сочи» может проскочить.</w:t>
-      </w:r>
-    </w:p>
-    <w:p>
-      <w:pPr>
-        <w:pStyle w:val="ListBullet"/>
-        <w:spacing w:after="60"/>
-      </w:pPr>
-      <w:r>
-        <w:rPr>
-          <w:rFonts w:ascii="Calibri" w:hAnsi="Calibri"/>
-          <w:sz w:val="22"/>
-        </w:rPr>
-        <w:t xml:space="preserve"> «-имеретинский морской порт» режет только запрос, где есть все три слова сразу. «Рыбалка Имеретинский порт» жива, и это правильно.</w:t>
+        <w:t>«-имеретинский морской порт» режет только три слова сразу. Ключи «рыбалка на имеретинском порту» и «рыбалка имеретинский порт» живы.</w:t>
       </w:r>
     </w:p>
     <w:p>
@@ -638,17 +665,7 @@
           <w:b w:val="0"/>
           <w:sz w:val="22"/>
         </w:rPr>
-        <w:t>География Россия. Автотаргетинг: целевые, узкие и широкие включены, сопутствующие и альтернативные выключены, запросы с брендом и без включены, бренды конкурентов выключены. Ссылки и уточнения как у кампании. Наценка аудитории «Просмотр сайта» +10%. Корректировку на ливень вы сняли. Ключ «морская прогулка с рыбалкой адлер» вы убрали, кампанийный минус «-морские прогулки» пусть остаётся.</w:t>
-      </w:r>
-    </w:p>
-    <w:p>
-      <w:r>
-        <w:rPr>
-          <w:rFonts w:ascii="Calibri" w:hAnsi="Calibri"/>
-          <w:b/>
-          <w:sz w:val="22"/>
-        </w:rPr>
-        <w:t>Проблемы:</w:t>
+        <w:t>География Россия. Автотаргетинг прежний: целевые, узкие и широкие включены, сопутствующие, альтернативные и чужие бренды выключены. Ссылки как у кампании.</w:t>
       </w:r>
     </w:p>
     <w:p>
@@ -661,7 +678,7 @@
           <w:rFonts w:ascii="Calibri" w:hAnsi="Calibri"/>
           <w:sz w:val="22"/>
         </w:rPr>
-        <w:t xml:space="preserve"> Минус «-яхты» закрывает «рыбалка на яхте в Сочи» и запросы с названием организации «Яхты Сириуса». Отдельные «аренда яхт», «прокат яхт» и «снять яхту» при этом уже лишние.</w:t>
+        <w:t>Минус «-яхты» закрывает «рыбалка на яхте» и название «Яхты Сириуса». Такой запрос забирает G10.</w:t>
       </w:r>
     </w:p>
     <w:p>
@@ -674,7 +691,7 @@
           <w:rFonts w:ascii="Calibri" w:hAnsi="Calibri"/>
           <w:sz w:val="22"/>
         </w:rPr>
-        <w:t xml:space="preserve"> Минуса «-трофейная», «-катран» и «-скат» отдают трофей в G9. При этом на кампанийном объявлении висит быстрая ссылка «Трофейная рыбалка». Человек пришёл на групповой запрос и видит трофей.</w:t>
+        <w:t>Минуса «-трофейная», «-катран» и «-скат» отдают трофей в G9. На объявлении при этом может висеть ссылка «Трофейная рыбалка», если группа берёт ссылки кампании.</w:t>
       </w:r>
     </w:p>
     <w:p>
@@ -687,7 +704,7 @@
           <w:rFonts w:ascii="Calibri" w:hAnsi="Calibri"/>
           <w:sz w:val="22"/>
         </w:rPr>
-        <w:t xml:space="preserve"> На ключе «морская рыбалка сириус -порт -групповой -катер» минус «-катер» отсекает «на катере». Отдельный ключ есть только на «с катера». Запрос «морская рыбалка на катере сириус» группа не ловит.</w:t>
+        <w:t>Запрос «морская рыбалка на катере сириус» ключом не закрыт: остался только «с катера». Его может взять автотаргетинг.</w:t>
       </w:r>
     </w:p>
     <w:p>
@@ -700,7 +717,7 @@
           <w:rFonts w:ascii="Calibri" w:hAnsi="Calibri"/>
           <w:sz w:val="22"/>
         </w:rPr>
-        <w:t xml:space="preserve"> Ключей на ставриду, кефаль и сарган в группе нет. Эти запросы из Москвы и Петербурга попадают только в широкий автотаргетинг: сезонная группа G5 ограничена Краснодарским краем.</w:t>
+        <w:t>Ключей на ставриду, кефаль и сарган нет. Для человека не из Краснодарского края это единственная группа на групповой билет, и сезонная рыба в ней не названа в ключах.</w:t>
       </w:r>
     </w:p>
     <w:p>
@@ -713,17 +730,7 @@
           <w:rFonts w:ascii="Calibri" w:hAnsi="Calibri"/>
           <w:sz w:val="22"/>
         </w:rPr>
-        <w:t xml:space="preserve"> Второй текст, 84 знака: «Не бронируйте весь катер - место в группе 2800 ₽, катамаран "Моряк Попай", до 8 чел.» Лимит текста 81. Фраза начинается с отказа.</w:t>
-      </w:r>
-    </w:p>
-    <w:p>
-      <w:r>
-        <w:rPr>
-          <w:rFonts w:ascii="Calibri" w:hAnsi="Calibri"/>
-          <w:b w:val="0"/>
-          <w:sz w:val="22"/>
-        </w:rPr>
-        <w:t>Заголовки G1–G3 в лимит 56 входят. Факты в них верные: 2 800 ₽, 3 часа, 12:00 и 15:00, до 8 человек, Имеретинка, линия 2, снасти, катамаран «Моряк Попай». Рыб в заголовках нет, сезон только в быстрой ссылке кампании.</w:t>
+        <w:t>Текст «Не бронируйте весь катер…» начинается с отказа. Директ его принимает, смысл лучше развернуть в приглашение занять место в группе.</w:t>
       </w:r>
     </w:p>
     <w:p>
@@ -741,278 +748,7 @@
           <w:b w:val="0"/>
           <w:sz w:val="22"/>
         </w:rPr>
-        <w:t>География только Краснодарский край. Автотаргетинг как в G1–G3. Уточнения как у кампании. Быстрые ссылки свои, их текст в переписку не попал. Наценка «Просмотр сайта» +10%.</w:t>
-      </w:r>
-    </w:p>
-    <w:p>
-      <w:r>
-        <w:rPr>
-          <w:rFonts w:ascii="Calibri" w:hAnsi="Calibri"/>
-          <w:b/>
-          <w:sz w:val="22"/>
-        </w:rPr>
-        <w:t>Заголовки, которые нельзя оставлять:</w:t>
-      </w:r>
-    </w:p>
-    <w:tbl>
-      <w:tblPr>
-        <w:tblStyle w:val="TableGrid"/>
-        <w:tblW w:type="auto" w:w="0"/>
-        <w:tblLook w:firstColumn="1" w:firstRow="1" w:lastColumn="0" w:lastRow="0" w:noHBand="0" w:noVBand="1" w:val="04A0"/>
-      </w:tblPr>
-      <w:tblGrid>
-        <w:gridCol w:w="3324"/>
-        <w:gridCol w:w="3324"/>
-        <w:gridCol w:w="3324"/>
-      </w:tblGrid>
-      <w:tr>
-        <w:tc>
-          <w:tcPr>
-            <w:tcW w:type="dxa" w:w="3324"/>
-          </w:tcPr>
-          <w:p>
-            <w:r/>
-            <w:r>
-              <w:rPr>
-                <w:rFonts w:ascii="Calibri" w:hAnsi="Calibri"/>
-                <w:b/>
-                <w:sz w:val="20"/>
-              </w:rPr>
-              <w:t>Заголовок</w:t>
-            </w:r>
-          </w:p>
-        </w:tc>
-        <w:tc>
-          <w:tcPr>
-            <w:tcW w:type="dxa" w:w="3324"/>
-          </w:tcPr>
-          <w:p>
-            <w:r/>
-            <w:r>
-              <w:rPr>
-                <w:rFonts w:ascii="Calibri" w:hAnsi="Calibri"/>
-                <w:b/>
-                <w:sz w:val="20"/>
-              </w:rPr>
-              <w:t>Знаков</w:t>
-            </w:r>
-          </w:p>
-        </w:tc>
-        <w:tc>
-          <w:tcPr>
-            <w:tcW w:type="dxa" w:w="3324"/>
-          </w:tcPr>
-          <w:p>
-            <w:r/>
-            <w:r>
-              <w:rPr>
-                <w:rFonts w:ascii="Calibri" w:hAnsi="Calibri"/>
-                <w:b/>
-                <w:sz w:val="20"/>
-              </w:rPr>
-              <w:t>В чём ошибка</w:t>
-            </w:r>
-          </w:p>
-        </w:tc>
-      </w:tr>
-      <w:tr>
-        <w:tc>
-          <w:tcPr>
-            <w:tcW w:type="dxa" w:w="3324"/>
-          </w:tcPr>
-          <w:p>
-            <w:r/>
-            <w:r>
-              <w:rPr>
-                <w:rFonts w:ascii="Calibri" w:hAnsi="Calibri"/>
-                <w:sz w:val="20"/>
-              </w:rPr>
-              <w:t>Морская рыбалка на пеламиду - катамаран "Моряк Попай"</w:t>
-            </w:r>
-          </w:p>
-        </w:tc>
-        <w:tc>
-          <w:tcPr>
-            <w:tcW w:type="dxa" w:w="3324"/>
-          </w:tcPr>
-          <w:p>
-            <w:r/>
-            <w:r>
-              <w:rPr>
-                <w:rFonts w:ascii="Calibri" w:hAnsi="Calibri"/>
-                <w:sz w:val="20"/>
-              </w:rPr>
-              <w:t>53</w:t>
-            </w:r>
-          </w:p>
-        </w:tc>
-        <w:tc>
-          <w:tcPr>
-            <w:tcW w:type="dxa" w:w="3324"/>
-          </w:tcPr>
-          <w:p>
-            <w:r/>
-            <w:r>
-              <w:rPr>
-                <w:rFonts w:ascii="Calibri" w:hAnsi="Calibri"/>
-                <w:sz w:val="20"/>
-              </w:rPr>
-              <w:t>Пеламида уже не сезон</w:t>
-            </w:r>
-          </w:p>
-        </w:tc>
-      </w:tr>
-      <w:tr>
-        <w:tc>
-          <w:tcPr>
-            <w:tcW w:type="dxa" w:w="3324"/>
-          </w:tcPr>
-          <w:p>
-            <w:r/>
-            <w:r>
-              <w:rPr>
-                <w:rFonts w:ascii="Calibri" w:hAnsi="Calibri"/>
-                <w:sz w:val="20"/>
-              </w:rPr>
-              <w:t>Сезонный клев на пеламиду - групповая рыбалка в Сириусе</w:t>
-            </w:r>
-          </w:p>
-        </w:tc>
-        <w:tc>
-          <w:tcPr>
-            <w:tcW w:type="dxa" w:w="3324"/>
-          </w:tcPr>
-          <w:p>
-            <w:r/>
-            <w:r>
-              <w:rPr>
-                <w:rFonts w:ascii="Calibri" w:hAnsi="Calibri"/>
-                <w:sz w:val="20"/>
-              </w:rPr>
-              <w:t>55</w:t>
-            </w:r>
-          </w:p>
-        </w:tc>
-        <w:tc>
-          <w:tcPr>
-            <w:tcW w:type="dxa" w:w="3324"/>
-          </w:tcPr>
-          <w:p>
-            <w:r/>
-            <w:r>
-              <w:rPr>
-                <w:rFonts w:ascii="Calibri" w:hAnsi="Calibri"/>
-                <w:sz w:val="20"/>
-              </w:rPr>
-              <w:t>Пеламида уже не сезон</w:t>
-            </w:r>
-          </w:p>
-        </w:tc>
-      </w:tr>
-      <w:tr>
-        <w:tc>
-          <w:tcPr>
-            <w:tcW w:type="dxa" w:w="3324"/>
-          </w:tcPr>
-          <w:p>
-            <w:r/>
-            <w:r>
-              <w:rPr>
-                <w:rFonts w:ascii="Calibri" w:hAnsi="Calibri"/>
-                <w:sz w:val="20"/>
-              </w:rPr>
-              <w:t>Групповая рыбалка в октябре - ставрида, кефаль, пеламида</w:t>
-            </w:r>
-          </w:p>
-        </w:tc>
-        <w:tc>
-          <w:tcPr>
-            <w:tcW w:type="dxa" w:w="3324"/>
-          </w:tcPr>
-          <w:p>
-            <w:r/>
-            <w:r>
-              <w:rPr>
-                <w:rFonts w:ascii="Calibri" w:hAnsi="Calibri"/>
-                <w:sz w:val="20"/>
-              </w:rPr>
-              <w:t>56</w:t>
-            </w:r>
-          </w:p>
-        </w:tc>
-        <w:tc>
-          <w:tcPr>
-            <w:tcW w:type="dxa" w:w="3324"/>
-          </w:tcPr>
-          <w:p>
-            <w:r/>
-            <w:r>
-              <w:rPr>
-                <w:rFonts w:ascii="Calibri" w:hAnsi="Calibri"/>
-                <w:sz w:val="20"/>
-              </w:rPr>
-              <w:t>Октябрь и пеламида</w:t>
-            </w:r>
-          </w:p>
-        </w:tc>
-      </w:tr>
-      <w:tr>
-        <w:tc>
-          <w:tcPr>
-            <w:tcW w:type="dxa" w:w="3324"/>
-          </w:tcPr>
-          <w:p>
-            <w:r/>
-            <w:r>
-              <w:rPr>
-                <w:rFonts w:ascii="Calibri" w:hAnsi="Calibri"/>
-                <w:sz w:val="20"/>
-              </w:rPr>
-              <w:t>3 часа рыбалки в море с катамарана - слоты каждый день,</w:t>
-            </w:r>
-          </w:p>
-        </w:tc>
-        <w:tc>
-          <w:tcPr>
-            <w:tcW w:type="dxa" w:w="3324"/>
-          </w:tcPr>
-          <w:p>
-            <w:r/>
-            <w:r>
-              <w:rPr>
-                <w:rFonts w:ascii="Calibri" w:hAnsi="Calibri"/>
-                <w:sz w:val="20"/>
-              </w:rPr>
-              <w:t>55</w:t>
-            </w:r>
-          </w:p>
-        </w:tc>
-        <w:tc>
-          <w:tcPr>
-            <w:tcW w:type="dxa" w:w="3324"/>
-          </w:tcPr>
-          <w:p>
-            <w:r/>
-            <w:r>
-              <w:rPr>
-                <w:rFonts w:ascii="Calibri" w:hAnsi="Calibri"/>
-                <w:sz w:val="20"/>
-              </w:rPr>
-              <w:t>Запятая в конце, слово «слоты»</w:t>
-            </w:r>
-          </w:p>
-        </w:tc>
-      </w:tr>
-    </w:tbl>
-    <w:p/>
-    <w:p>
-      <w:r>
-        <w:rPr>
-          <w:rFonts w:ascii="Calibri" w:hAnsi="Calibri"/>
-          <w:b w:val="0"/>
-          <w:sz w:val="22"/>
-        </w:rPr>
-        <w:t>Рабочие заголовки группы: «Групповая рыбалка в Сочи, сезон ставриды - 2800 ₽ / чел.» (56) и «Ставрида и кефаль - ноябрь - сезон рыбалки в Сочи» (49), «Рыбалка в Сириусе на ставриду - катамаран на линии 2» (52). Саргана нет ни в одном объявлении, хотя ключи на него есть. Быстрая ссылка кампании при этом говорит ноябрь–декабрь и три рыбы, включая сарган. Если у G5 свои ссылки, их надо сверить отдельно.</w:t>
+        <w:t>География только Краснодарский край. Свои быстрые ссылки. Сезон в ссылке верный: ноябрь/декабрь, ставрида, кефаль, сарган. Расписание в ссылке верное: 12:00 и 15:00, 3 часа. Телефон в ссылке 918 304-40-00. Причал в ссылке: Голубая, 1, это совпадает с низом страницы.</w:t>
       </w:r>
     </w:p>
     <w:p>
@@ -1025,7 +761,7 @@
           <w:rFonts w:ascii="Calibri" w:hAnsi="Calibri"/>
           <w:sz w:val="22"/>
         </w:rPr>
-        <w:t xml:space="preserve"> Текст про кефаль и ставриду входит: 76 знаков. Сезонный текст про Сириус входит: 80. Текст «Не бронируйте весь катер…» снова 84.</w:t>
+        <w:t>Заголовок «3 часа рыбалки в море с катамарана - слоты каждый день,» заканчивается запятой. Слово «слоты» для гостя хуже, чем «выходы».</w:t>
       </w:r>
     </w:p>
     <w:p>
@@ -1038,7 +774,7 @@
           <w:rFonts w:ascii="Calibri" w:hAnsi="Calibri"/>
           <w:sz w:val="22"/>
         </w:rPr>
-        <w:t xml:space="preserve"> Короткие ключи с «-рыбалка -ловля» ловят запросы вроде «ставрида сочи» без слова «рыбалка». Часть уходит в магазин и кухню. Минуса кафе, ресторан, купить и рынок часть этого закрывают, но не всё.</w:t>
+        <w:t>В одном тексте названы только ставрида и кефаль. Сарган есть в заголовке «Групповая рыбалка в ноябре» и в ссылке. Директ собирает комбинации сам, противоречия здесь нет.</w:t>
       </w:r>
     </w:p>
     <w:p>
@@ -1051,7 +787,7 @@
           <w:rFonts w:ascii="Calibri" w:hAnsi="Calibri"/>
           <w:sz w:val="22"/>
         </w:rPr>
-        <w:t xml:space="preserve"> Минус «-яхты» тот же, что в G1–G3. «-луфаря» здесь уместен. «-аренда» и «-прокат» широкие и свои рыболовные запросы не режут.</w:t>
+        <w:t>Ссылка «Трофейная рыбалка» висит на сезонной группе билета 2 800 ₽. Минуса группы трофейный запрос в G5 не пускают, но с группового объявления на трофей уйти можно.</w:t>
       </w:r>
     </w:p>
     <w:p>
@@ -1064,7 +800,20 @@
           <w:rFonts w:ascii="Calibri" w:hAnsi="Calibri"/>
           <w:sz w:val="22"/>
         </w:rPr>
-        <w:t xml:space="preserve"> Вложенные минуса «-морской -катер -групповой -сочи -ноябрь» только раскладывают запрос по соседним ключам. Парные ключи на месте.</w:t>
+        <w:t>Короткие ключи с «-рыбалка -ловля» ловят «ставрида сочи» без слова «рыбалка». Часть таких запросов про магазин и кухню. Кафе, ресторан, купить и рынок часть закрывают.</w:t>
+      </w:r>
+    </w:p>
+    <w:p>
+      <w:pPr>
+        <w:pStyle w:val="ListBullet"/>
+        <w:spacing w:after="60"/>
+      </w:pPr>
+      <w:r>
+        <w:rPr>
+          <w:rFonts w:ascii="Calibri" w:hAnsi="Calibri"/>
+          <w:sz w:val="22"/>
+        </w:rPr>
+        <w:t>Минус «-яхты» тот же, что в G1–G3. «-луфаря» здесь уместен.</w:t>
       </w:r>
     </w:p>
     <w:p>
@@ -1082,37 +831,7 @@
           <w:b w:val="0"/>
           <w:sz w:val="22"/>
         </w:rPr>
-        <w:t>Это трофей и катамаран целиком: от 20 000 ₽, от 3 часов, до 8 человек, скат (морской кот, хвостокол, морская лисица), причал Парусная, 1. География Россия, автотаргетинг как в G1–G3, наценка «Просмотр сайта» +10%.</w:t>
-      </w:r>
-    </w:p>
-    <w:p>
-      <w:r>
-        <w:rPr>
-          <w:rFonts w:ascii="Calibri" w:hAnsi="Calibri"/>
-          <w:b/>
-          <w:sz w:val="22"/>
-        </w:rPr>
-        <w:t>Минус «-рыбалка» выключает группу.</w:t>
-      </w:r>
-    </w:p>
-    <w:p>
-      <w:r>
-        <w:rPr>
-          <w:rFonts w:ascii="Calibri" w:hAnsi="Calibri"/>
-          <w:b w:val="0"/>
-          <w:sz w:val="22"/>
-        </w:rPr>
-        <w:t>Директ не показывает запрос, в котором есть минус-слово. В 17 ключах из 20 слово «рыбалка» уже есть, поэтому они молчат. Живы только три: «моряк попай целиком», «моряк попай аренда», «катамаран целиком сириус». «Трофейная рыбалка сочи» и «рыбалка на ската» не поймает ни G9, ни G1–G3, ни G5.</w:t>
-      </w:r>
-    </w:p>
-    <w:p>
-      <w:r>
-        <w:rPr>
-          <w:rFonts w:ascii="Calibri" w:hAnsi="Calibri"/>
-          <w:b w:val="0"/>
-          <w:sz w:val="22"/>
-        </w:rPr>
-        <w:t>Минуса «-группа», «-групповая», «-билет», «-!за человека», «-2800», «-1800», «-2300», «-2500», «-слоты», «-экскурсия», «-ставрида», «-пеламида» как раз отделяют трофей от группового билета. Их оставлять.</w:t>
+        <w:t>Трофей и катамаран целиком, от 20 000 ₽, от 3 часов. География Россия. Минус «-рыбалка» снят, ключи со словом «рыбалка» снова рабочие. Минуса «-группа», «-групповая», «-билет» и «-!за человека» по-прежнему отделяют трофей от билета 2 800 ₽. Цены 1800, 2300, 2500 и 2800 из минусов убраны: запрос с ценой группового билета, но без слов «группа» и «билет», может прилипнуть широким автотаргетингом.</w:t>
       </w:r>
     </w:p>
     <w:p>
@@ -1125,7 +844,7 @@
           <w:rFonts w:ascii="Calibri" w:hAnsi="Calibri"/>
           <w:sz w:val="22"/>
         </w:rPr>
-        <w:t xml:space="preserve"> «-стоимость катамарана» режет запрос про цену аренды. Для трофея это как раз целевой спрос.</w:t>
+        <w:t>В тексте объявления названы скат, ставрида и кефаль, а минус «-ставрида» не пускает запрос про ставриду в эту группу. На объявлении про ската ставрида может остаться как прилов.</w:t>
       </w:r>
     </w:p>
     <w:p>
@@ -1138,7 +857,7 @@
           <w:rFonts w:ascii="Calibri" w:hAnsi="Calibri"/>
           <w:sz w:val="22"/>
         </w:rPr>
-        <w:t xml:space="preserve"> «-парусная» режет улицу Парусная. «-парус» режет парусные лодки и улицу не трогает.</w:t>
+        <w:t>Минус «-яхты» снова режет «Яхты Сириуса» и «рыбалка на яхте». Этот спрос уходит в G10, на билет 2 800 ₽.</w:t>
       </w:r>
     </w:p>
     <w:p>
@@ -1151,7 +870,7 @@
           <w:rFonts w:ascii="Calibri" w:hAnsi="Calibri"/>
           <w:sz w:val="22"/>
         </w:rPr>
-        <w:t xml:space="preserve"> «-яхты» снова режет «Яхты Сириуса» и «рыбалка на яхте».</w:t>
+        <w:t>Минус «-парусная» режет слово «парусная». На сайте причал записан как Голубая, 1, поэтому адрес выхода этот минус не гасит.</w:t>
       </w:r>
     </w:p>
     <w:p>
@@ -1164,231 +883,59 @@
           <w:rFonts w:ascii="Calibri" w:hAnsi="Calibri"/>
           <w:sz w:val="22"/>
         </w:rPr>
-        <w:t xml:space="preserve"> Ключ «индивидуальная рыбалка сириус» повторён дважды, один раз с «-морской».</w:t>
+        <w:t>Минус «-стоимость катамарана» снят. Запрос про цену аренды снова может найти группу.</w:t>
       </w:r>
     </w:p>
     <w:p>
+      <w:pPr>
+        <w:pStyle w:val="ListBullet"/>
+        <w:spacing w:after="60"/>
+      </w:pPr>
       <w:r>
         <w:rPr>
           <w:rFonts w:ascii="Calibri" w:hAnsi="Calibri"/>
-          <w:b/>
           <w:sz w:val="22"/>
         </w:rPr>
-        <w:t>Тексты, лимит 81, все три длиннее:</w:t>
+        <w:t>Ключ «индивидуальная рыбалка сириус» по-прежнему повторён, один раз с «-морской».</w:t>
       </w:r>
     </w:p>
-    <w:tbl>
-      <w:tblPr>
-        <w:tblStyle w:val="TableGrid"/>
-        <w:tblW w:type="auto" w:w="0"/>
-        <w:tblLook w:firstColumn="1" w:firstRow="1" w:lastColumn="0" w:lastRow="0" w:noHBand="0" w:noVBand="1" w:val="04A0"/>
-      </w:tblPr>
-      <w:tblGrid>
-        <w:gridCol w:w="3324"/>
-        <w:gridCol w:w="3324"/>
-        <w:gridCol w:w="3324"/>
-      </w:tblGrid>
-      <w:tr>
-        <w:tc>
-          <w:tcPr>
-            <w:tcW w:type="dxa" w:w="3324"/>
-          </w:tcPr>
-          <w:p>
-            <w:r/>
-            <w:r>
-              <w:rPr>
-                <w:rFonts w:ascii="Calibri" w:hAnsi="Calibri"/>
-                <w:b/>
-                <w:sz w:val="20"/>
-              </w:rPr>
-              <w:t>Текст</w:t>
-            </w:r>
-          </w:p>
-        </w:tc>
-        <w:tc>
-          <w:tcPr>
-            <w:tcW w:type="dxa" w:w="3324"/>
-          </w:tcPr>
-          <w:p>
-            <w:r/>
-            <w:r>
-              <w:rPr>
-                <w:rFonts w:ascii="Calibri" w:hAnsi="Calibri"/>
-                <w:b/>
-                <w:sz w:val="20"/>
-              </w:rPr>
-              <w:t>Знаков</w:t>
-            </w:r>
-          </w:p>
-        </w:tc>
-        <w:tc>
-          <w:tcPr>
-            <w:tcW w:type="dxa" w:w="3324"/>
-          </w:tcPr>
-          <w:p>
-            <w:r/>
-            <w:r>
-              <w:rPr>
-                <w:rFonts w:ascii="Calibri" w:hAnsi="Calibri"/>
-                <w:b/>
-                <w:sz w:val="20"/>
-              </w:rPr>
-              <w:t>Ещё</w:t>
-            </w:r>
-          </w:p>
-        </w:tc>
-      </w:tr>
-      <w:tr>
-        <w:tc>
-          <w:tcPr>
-            <w:tcW w:type="dxa" w:w="3324"/>
-          </w:tcPr>
-          <w:p>
-            <w:r/>
-            <w:r>
-              <w:rPr>
-                <w:rFonts w:ascii="Calibri" w:hAnsi="Calibri"/>
-                <w:sz w:val="20"/>
-              </w:rPr>
-              <w:t>Трофейная рыбалка на катамаране "Моряк Попай"- судно целиком, от 20 000 ₽, от 3-х час</w:t>
-            </w:r>
-          </w:p>
-        </w:tc>
-        <w:tc>
-          <w:tcPr>
-            <w:tcW w:type="dxa" w:w="3324"/>
-          </w:tcPr>
-          <w:p>
-            <w:r/>
-            <w:r>
-              <w:rPr>
-                <w:rFonts w:ascii="Calibri" w:hAnsi="Calibri"/>
-                <w:sz w:val="20"/>
-              </w:rPr>
-              <w:t>85</w:t>
-            </w:r>
-          </w:p>
-        </w:tc>
-        <w:tc>
-          <w:tcPr>
-            <w:tcW w:type="dxa" w:w="3324"/>
-          </w:tcPr>
-          <w:p>
-            <w:r/>
-            <w:r>
-              <w:rPr>
-                <w:rFonts w:ascii="Calibri" w:hAnsi="Calibri"/>
-                <w:sz w:val="20"/>
-              </w:rPr>
-              <w:t>Нет пробела перед дефисом, «час» обрезано</w:t>
-            </w:r>
-          </w:p>
-        </w:tc>
-      </w:tr>
-      <w:tr>
-        <w:tc>
-          <w:tcPr>
-            <w:tcW w:type="dxa" w:w="3324"/>
-          </w:tcPr>
-          <w:p>
-            <w:r/>
-            <w:r>
-              <w:rPr>
-                <w:rFonts w:ascii="Calibri" w:hAnsi="Calibri"/>
-                <w:sz w:val="20"/>
-              </w:rPr>
-              <w:t>Индивидуальная рыбалка в Сириусе: скат, ставрида, кефаль, "Моряк Попай", до 8 человек</w:t>
-            </w:r>
-          </w:p>
-        </w:tc>
-        <w:tc>
-          <w:tcPr>
-            <w:tcW w:type="dxa" w:w="3324"/>
-          </w:tcPr>
-          <w:p>
-            <w:r/>
-            <w:r>
-              <w:rPr>
-                <w:rFonts w:ascii="Calibri" w:hAnsi="Calibri"/>
-                <w:sz w:val="20"/>
-              </w:rPr>
-              <w:t>85</w:t>
-            </w:r>
-          </w:p>
-        </w:tc>
-        <w:tc>
-          <w:tcPr>
-            <w:tcW w:type="dxa" w:w="3324"/>
-          </w:tcPr>
-          <w:p>
-            <w:r/>
-            <w:r>
-              <w:rPr>
-                <w:rFonts w:ascii="Calibri" w:hAnsi="Calibri"/>
-                <w:sz w:val="20"/>
-              </w:rPr>
-              <w:t>В тексте ставрида, в минусах группы её нет</w:t>
-            </w:r>
-          </w:p>
-        </w:tc>
-      </w:tr>
-      <w:tr>
-        <w:tc>
-          <w:tcPr>
-            <w:tcW w:type="dxa" w:w="3324"/>
-          </w:tcPr>
-          <w:p>
-            <w:r/>
-            <w:r>
-              <w:rPr>
-                <w:rFonts w:ascii="Calibri" w:hAnsi="Calibri"/>
-                <w:sz w:val="20"/>
-              </w:rPr>
-              <w:t>Катамаран "Моряк Попай" для вашей компании до 8 чел. Трофейная рыбалка из Сириуса.</w:t>
-            </w:r>
-          </w:p>
-        </w:tc>
-        <w:tc>
-          <w:tcPr>
-            <w:tcW w:type="dxa" w:w="3324"/>
-          </w:tcPr>
-          <w:p>
-            <w:r/>
-            <w:r>
-              <w:rPr>
-                <w:rFonts w:ascii="Calibri" w:hAnsi="Calibri"/>
-                <w:sz w:val="20"/>
-              </w:rPr>
-              <w:t>82</w:t>
-            </w:r>
-          </w:p>
-        </w:tc>
-        <w:tc>
-          <w:tcPr>
-            <w:tcW w:type="dxa" w:w="3324"/>
-          </w:tcPr>
-          <w:p>
-            <w:r/>
-            <w:r>
-              <w:rPr>
-                <w:rFonts w:ascii="Calibri" w:hAnsi="Calibri"/>
-                <w:sz w:val="20"/>
-              </w:rPr>
-              <w:t>На один знак длиннее</w:t>
-            </w:r>
-          </w:p>
-        </w:tc>
-      </w:tr>
-    </w:tbl>
-    <w:p/>
     <w:p>
+      <w:pPr>
+        <w:pStyle w:val="ListBullet"/>
+        <w:spacing w:after="60"/>
+      </w:pPr>
       <w:r>
         <w:rPr>
           <w:rFonts w:ascii="Calibri" w:hAnsi="Calibri"/>
-          <w:b w:val="0"/>
           <w:sz w:val="22"/>
         </w:rPr>
-        <w:t>Заголовки G9 в 56 знаков входят. Быстрые ссылки в лимиты 30 и 60 входят. В описании брони опечатка «мессенждер». Ссылка «Групповой билет на рыбалку» за 2 800 ₽ стоит внутри трофейной группы и уводит на другой формат. В уточнении написано «картан и скат»: опечатка, и катран это другой вид. На сайте трофей описан как морской кот и морская лисица. Телефон в ссылке снова 918, не 917.</w:t>
+        <w:t>В уточнении, если его не меняли, написано «картан и скат». Катран это другой вид. На сайте трофей: морской кот и морская лисица.</w:t>
+      </w:r>
+    </w:p>
+    <w:p>
+      <w:pPr>
+        <w:pStyle w:val="ListBullet"/>
+        <w:spacing w:after="60"/>
+      </w:pPr>
+      <w:r>
+        <w:rPr>
+          <w:rFonts w:ascii="Calibri" w:hAnsi="Calibri"/>
+          <w:sz w:val="22"/>
+        </w:rPr>
+        <w:t>В ссылке брони, если её не меняли, опечатка «мессенждер». В ссылках G5 написано правильно: «мессенджер».</w:t>
+      </w:r>
+    </w:p>
+    <w:p>
+      <w:pPr>
+        <w:pStyle w:val="ListBullet"/>
+        <w:spacing w:after="60"/>
+      </w:pPr>
+      <w:r>
+        <w:rPr>
+          <w:rFonts w:ascii="Calibri" w:hAnsi="Calibri"/>
+          <w:sz w:val="22"/>
+        </w:rPr>
+        <w:t>Ссылка «Групповой билет 2 800 ₽» стоит внутри трофейной группы и уводит на другой формат.</w:t>
       </w:r>
     </w:p>
     <w:p>
@@ -1406,17 +953,7 @@
           <w:b w:val="0"/>
           <w:sz w:val="22"/>
         </w:rPr>
-        <w:t>Широкая морская рыбалка на групповой билет. География Россия, автотаргетинг как в G1–G3, ссылки и уточнения как у кампании. Цена конверсии группы +5%, аудитория «Просмотр сайта» +10%.</w:t>
-      </w:r>
-    </w:p>
-    <w:p>
-      <w:r>
-        <w:rPr>
-          <w:rFonts w:ascii="Calibri" w:hAnsi="Calibri"/>
-          <w:b/>
-          <w:sz w:val="22"/>
-        </w:rPr>
-        <w:t>Два ключа мертвы из‑за минусов кампании:</w:t>
+        <w:t>Широкая морская рыбалка, групповой билет, география Россия. Ссылки как у кампании. Цена конверсии группы +5%, аудитория «Просмотр сайта» +10%.</w:t>
       </w:r>
     </w:p>
     <w:p>
@@ -1429,7 +966,7 @@
           <w:rFonts w:ascii="Calibri" w:hAnsi="Calibri"/>
           <w:sz w:val="22"/>
         </w:rPr>
-        <w:t xml:space="preserve"> «рыбалка дагомыс море» закрыт кампанийным «-дагомыс».</w:t>
+        <w:t>«рыбалка хоста море» живой. Дагомыс и Лоо отсечены, Хоста нет. Человек ищет рыбалку в Хосте, выход из Имеретинского порта.</w:t>
       </w:r>
     </w:p>
     <w:p>
@@ -1442,17 +979,7 @@
           <w:rFonts w:ascii="Calibri" w:hAnsi="Calibri"/>
           <w:sz w:val="22"/>
         </w:rPr>
-        <w:t xml:space="preserve"> «рыбалка лоо море» закрыт кампанийным «-лоо».</w:t>
-      </w:r>
-    </w:p>
-    <w:p>
-      <w:r>
-        <w:rPr>
-          <w:rFonts w:ascii="Calibri" w:hAnsi="Calibri"/>
-          <w:b/>
-          <w:sz w:val="22"/>
-        </w:rPr>
-        <w:t>Остальные ключи и тексты:</w:t>
+        <w:t>«рыбалка с яхты сочи» живой и ведёт на катамаран за 2 800 ₽. В остальных группах «-яхты» этот запрос закрывает.</w:t>
       </w:r>
     </w:p>
     <w:p>
@@ -1465,7 +992,7 @@
           <w:rFonts w:ascii="Calibri" w:hAnsi="Calibri"/>
           <w:sz w:val="22"/>
         </w:rPr>
-        <w:t xml:space="preserve"> «рыбалка хоста море» живой. Дагомыс и Лоо вы отсекли, Хосту нет. Человек ищет рыбалку в Хосте, выход у вас из Имеретинки.</w:t>
+        <w:t>«"рыбалка в черном море"» в кавычках ловит весь берег, не только Сочи. Крым, Геленджик, Анапа и Туапсе минусами закрыты, запрос без города нет.</w:t>
       </w:r>
     </w:p>
     <w:p>
@@ -1478,7 +1005,7 @@
           <w:rFonts w:ascii="Calibri" w:hAnsi="Calibri"/>
           <w:sz w:val="22"/>
         </w:rPr>
-        <w:t xml:space="preserve"> «"рыбалка в черном море"» в кавычках ловит весь берег, не только Сочи. Крым и Геленджик минусами закрыты, запрос без города нет.</w:t>
+        <w:t>Минуса «-трофейная», «-трофей», «-целиком», «-индивидуальная», «-20000» и «-20 000» правильно отдают трофей в G9.</w:t>
       </w:r>
     </w:p>
     <w:p>
@@ -1491,7 +1018,7 @@
           <w:rFonts w:ascii="Calibri" w:hAnsi="Calibri"/>
           <w:sz w:val="22"/>
         </w:rPr>
-        <w:t xml:space="preserve"> «"ловля камбалы в сочи"» ведёт на объявление про ставриду и кефаль. Камбала не рыба трёхчасового выхода у берега, и в текстах её нет.</w:t>
+        <w:t>Интересы и привычки: «Рыбалка», «Отдых в Сочи», рыболовные сайты и приложения, среди них boatfishing-sochi.ru и rental-yacht.ru. Если это условие показа, а не наценка, человек без метки рыбака объявление не увидит.</w:t>
       </w:r>
     </w:p>
     <w:p>
@@ -1504,7 +1031,15 @@
           <w:rFonts w:ascii="Calibri" w:hAnsi="Calibri"/>
           <w:sz w:val="22"/>
         </w:rPr>
-        <w:t xml:space="preserve"> «рыбалка с яхты сочи» живой: в G10 нет минуса «-яхты», а в G1–G3, G5 и G9 он есть. На запрос про яхту выйдет групповой катамаран за 2 800 ₽.</w:t>
+        <w:t>Тексты обещают ставриду и кефаль, слоты 12:00 и 15:00. Сарган в текстах G10 не назван, он есть в сезонной ссылке, если группа берёт ссылки кампании.</w:t>
+      </w:r>
+    </w:p>
+    <w:p>
+      <w:pPr>
+        <w:pStyle w:val="Heading1"/>
+      </w:pPr>
+      <w:r>
+        <w:t>Что сходится</w:t>
       </w:r>
     </w:p>
     <w:p>
@@ -1517,7 +1052,7 @@
           <w:rFonts w:ascii="Calibri" w:hAnsi="Calibri"/>
           <w:sz w:val="22"/>
         </w:rPr>
-        <w:t xml:space="preserve"> «рыбалка в открытом море сочи» повторяет ключ G1–G3. Обе группы на всю Россию и спорят за один запрос.</w:t>
+        <w:t>2 800 ₽, 3 часа, до 8 человек, снасти, улов на борту.</w:t>
       </w:r>
     </w:p>
     <w:p>
@@ -1530,7 +1065,7 @@
           <w:rFonts w:ascii="Calibri" w:hAnsi="Calibri"/>
           <w:sz w:val="22"/>
         </w:rPr>
-        <w:t xml:space="preserve"> Минус «-парусная» снова режет улицу причала. Минуса «-трофейная», «-трофей», «-целиком», «-индивидуальная», «-20000» и «-20 000» правильно отдают трофей в G9. «-волнорез» и «-рокфишинг» уместны.</w:t>
+        <w:t>В текстах объявлений слоты 12:00 и 15:00.</w:t>
       </w:r>
     </w:p>
     <w:p>
@@ -1543,25 +1078,7 @@
           <w:rFonts w:ascii="Calibri" w:hAnsi="Calibri"/>
           <w:sz w:val="22"/>
         </w:rPr>
-        <w:t xml:space="preserve"> Заголовки входят в 56 знаков. Слоты 12:00 и 15:00 верные, пеламиды нет. Саргана в текстах нет. Текст «Не бронируйте весь катер…» снова 84 знака. Два других текста входят: 76 и 78.</w:t>
-      </w:r>
-    </w:p>
-    <w:p>
-      <w:r>
-        <w:rPr>
-          <w:rFonts w:ascii="Calibri" w:hAnsi="Calibri"/>
-          <w:b w:val="0"/>
-          <w:sz w:val="22"/>
-        </w:rPr>
-        <w:t>Интересы и привычки группы: «Рыбалка», «Отдых в Сочи», приложения Fishing forecast и «Рыбные точки», сайты ohotniki.ru, rusfishing.ru, morskayarybalka.ru, boatfishing-sochi.ru, rental-yacht.ru и ещё ряд рыболовных хостов. В сообщении не сказано, это условие показа или только наценка. Если это условие показа, турист без метки рыбака объявление не увидит. boatfishing-sochi.ru и rental-yacht.ru это чужие сайты про рыбалку и аренду яхт.</w:t>
-      </w:r>
-    </w:p>
-    <w:p>
-      <w:pPr>
-        <w:pStyle w:val="Heading1"/>
-      </w:pPr>
-      <w:r>
-        <w:t>Что уже сходится</w:t>
+        <w:t>Трофей от 20 000 ₽ и от 3 часов совпадает со страницей: морской кот и морская лисица.</w:t>
       </w:r>
     </w:p>
     <w:p>
@@ -1574,7 +1091,7 @@
           <w:rFonts w:ascii="Calibri" w:hAnsi="Calibri"/>
           <w:sz w:val="22"/>
         </w:rPr>
-        <w:t xml:space="preserve"> Цена группы 2 800 ₽, 3 часа, до 8 человек, снасти включены, улов готовят на борту.</w:t>
+        <w:t>Сезон на странице и в ссылке G5: ноябрь–декабрь, ставрида, кефаль, сарган.</w:t>
       </w:r>
     </w:p>
     <w:p>
@@ -1587,72 +1104,7 @@
           <w:rFonts w:ascii="Calibri" w:hAnsi="Calibri"/>
           <w:sz w:val="22"/>
         </w:rPr>
-        <w:t xml:space="preserve"> Слоты в текстах G1–G3 и G10: 12:00 и 15:00.</w:t>
-      </w:r>
-    </w:p>
-    <w:p>
-      <w:pPr>
-        <w:pStyle w:val="ListBullet"/>
-        <w:spacing w:after="60"/>
-      </w:pPr>
-      <w:r>
-        <w:rPr>
-          <w:rFonts w:ascii="Calibri" w:hAnsi="Calibri"/>
-          <w:sz w:val="22"/>
-        </w:rPr>
-        <w:t xml:space="preserve"> Трофей от 20 000 ₽ и от 3 часов совпадает с сайтом.</w:t>
-      </w:r>
-    </w:p>
-    <w:p>
-      <w:pPr>
-        <w:pStyle w:val="ListBullet"/>
-        <w:spacing w:after="60"/>
-      </w:pPr>
-      <w:r>
-        <w:rPr>
-          <w:rFonts w:ascii="Calibri" w:hAnsi="Calibri"/>
-          <w:sz w:val="22"/>
-        </w:rPr>
-        <w:t xml:space="preserve"> Сезон в быстрой ссылке кампании: ноябрь–декабрь, ставрида, кефаль, сарган.</w:t>
-      </w:r>
-    </w:p>
-    <w:p>
-      <w:pPr>
-        <w:pStyle w:val="ListBullet"/>
-        <w:spacing w:after="60"/>
-      </w:pPr>
-      <w:r>
-        <w:rPr>
-          <w:rFonts w:ascii="Calibri" w:hAnsi="Calibri"/>
-          <w:sz w:val="22"/>
-        </w:rPr>
-        <w:t xml:space="preserve"> Автотаргетинг во всех присланных группах настроен одинаково и разумно: широкие включены, сопутствующие, альтернативные и чужие бренды выключены.</w:t>
-      </w:r>
-    </w:p>
-    <w:p>
-      <w:pPr>
-        <w:pStyle w:val="ListBullet"/>
-        <w:spacing w:after="60"/>
-      </w:pPr>
-      <w:r>
-        <w:rPr>
-          <w:rFonts w:ascii="Calibri" w:hAnsi="Calibri"/>
-          <w:sz w:val="22"/>
-        </w:rPr>
-        <w:t xml:space="preserve"> Уточнения кампании короче 25 знаков, сумма набора 147.</w:t>
-      </w:r>
-    </w:p>
-    <w:p>
-      <w:pPr>
-        <w:pStyle w:val="ListBullet"/>
-        <w:spacing w:after="60"/>
-      </w:pPr>
-      <w:r>
-        <w:rPr>
-          <w:rFonts w:ascii="Calibri" w:hAnsi="Calibri"/>
-          <w:sz w:val="22"/>
-        </w:rPr>
-        <w:t xml:space="preserve"> Запрещённые площадки к рыбалке не относятся, список можно оставить.</w:t>
+        <w:t>Автотаргетинг во всех присланных группах одинаковый: широкие включены, сопутствующие, альтернативные и чужие бренды выключены.</w:t>
       </w:r>
     </w:p>
     <w:p>
@@ -1662,7 +1114,7 @@
           <w:b w:val="0"/>
           <w:sz w:val="22"/>
         </w:rPr>
-        <w:t>Стратегия на момент просмотра училась: 1 конверсия из 10 за 2 дня, бюджет 10 000 ₽ в неделю, оплата за конверсии. Тексты, ключи и минус-слова на это обучение не завязаны. Бюджет, цены целей и места показа лучше не трогать, пока Директ сам не выйдет из обучения.</w:t>
+        <w:t>Бюджет, цены целей и места показа в этот проход не разбирались. Пока стратегия учится, их лучше не двигать. Тексты, ключи и минус-слова на обучение ставок не завязаны.</w:t>
       </w:r>
     </w:p>
     <w:sectPr>
@@ -2039,7 +1491,7 @@
     <w:qFormat/>
     <w:rsid w:val="00FC693F"/>
     <w:pPr>
-      <w:spacing w:after="120" w:before="0"/>
+      <w:spacing w:after="120"/>
     </w:pPr>
     <w:rPr>
       <w:rFonts w:ascii="Calibri" w:hAnsi="Calibri" w:eastAsia="Calibri"/>

</xml_diff>

<commit_message>
Refresh the Direct mismatch list and add seasonal keywords.
Co-authored-by: Igor-Lark <Igor-Lark@users.noreply.github.com>
</commit_message>
<xml_diff>
--- a/cursor/Nestykovki_Direct_RB_Popaj_2026-10-30.docx
+++ b/cursor/Nestykovki_Direct_RB_Popaj_2026-10-30.docx
@@ -18,7 +18,7 @@
           <w:b w:val="0"/>
           <w:sz w:val="22"/>
         </w:rPr>
-        <w:t>Кампания ЕПК «Групповая рыбалка», № 713632237. Страница boat-sochi.ru/gruppovaja_ribalka проверена 30 октября 2026, около 22:40 мск. Лимиты Директа в этот список не входят: тексты и заголовки сервис принимает.</w:t>
+        <w:t>Кампания № 713632237. Страница проверена 30 октября 2026, около 23:00 мск. Выход с катамарана в открытое море. Минус-фразы кампании не разбираются: их оставляем как есть.</w:t>
       </w:r>
     </w:p>
     <w:p>
@@ -26,7 +26,7 @@
         <w:pStyle w:val="Heading1"/>
       </w:pPr>
       <w:r>
-        <w:t>Что уже поправлено</w:t>
+        <w:t>Нестыковки</w:t>
       </w:r>
     </w:p>
     <w:p>
@@ -39,7 +39,7 @@
           <w:rFonts w:ascii="Calibri" w:hAnsi="Calibri"/>
           <w:sz w:val="22"/>
         </w:rPr>
-        <w:t>На странице сезон ноябрь–декабрь: ставрида, кефаль, сарган. Барабули в этом абзаце нет. Быстрая ссылка G5 говорит то же.</w:t>
+        <w:t>На странице в расписании три времени: 9:00, 12:00 и 15:00. В объявлениях и в ссылке G5 два выхода: 12:00 и 15:00.</w:t>
       </w:r>
     </w:p>
     <w:p>
@@ -52,7 +52,7 @@
           <w:rFonts w:ascii="Calibri" w:hAnsi="Calibri"/>
           <w:sz w:val="22"/>
         </w:rPr>
-        <w:t>В заголовках G5 нет пеламиды и октября. Есть ноябрь, ставрида, кефаль и сарган.</w:t>
+        <w:t>На карточке ставриды лучший клёв указан рано утром или вечером. Катамаран уходит в 12:00 и 15:00.</w:t>
       </w:r>
     </w:p>
     <w:p>
@@ -65,7 +65,7 @@
           <w:rFonts w:ascii="Calibri" w:hAnsi="Calibri"/>
           <w:sz w:val="22"/>
         </w:rPr>
-        <w:t>Из G9 убран минус «-рыбалка». Группа снова может показываться по своим ключам.</w:t>
+        <w:t>Карточка кефали описывает лов у бун и в устьях рек. Продукт — катамаран, который уходит в открытое море. В сезонном абзаце кефаль только «подходит ближе к берегу», без бун.</w:t>
       </w:r>
     </w:p>
     <w:p>
@@ -78,7 +78,7 @@
           <w:rFonts w:ascii="Calibri" w:hAnsi="Calibri"/>
           <w:sz w:val="22"/>
         </w:rPr>
-        <w:t>В минусах кампании появились «-корабль» и «-лазаревск». «-инструктор» снят.</w:t>
+        <w:t>На странице причал записан так: улица Голубая, 1, Имеретинский порт, линия 2. Ссылка G5 повторяет Голубую. Ссылка G9 пишет «Парусная, 1». Если ссылки кампании для G1–G3 и G10 не менялись, там тоже Парусная, и этой улицы на странице нет.</w:t>
       </w:r>
     </w:p>
     <w:p>
@@ -91,7 +91,7 @@
           <w:rFonts w:ascii="Calibri" w:hAnsi="Calibri"/>
           <w:sz w:val="22"/>
         </w:rPr>
-        <w:t>Из G10 убраны мёртвые ключи Дагомыса и Лоо, ключ про камбалу и повтор «рыбалка в открытом море сочи».</w:t>
+        <w:t>Заголовок G5 обрывается запятой: «3 часа рыбалки в море с катамарана - выходы каждый день,».</w:t>
       </w:r>
     </w:p>
     <w:p>
@@ -104,511 +104,7 @@
           <w:rFonts w:ascii="Calibri" w:hAnsi="Calibri"/>
           <w:sz w:val="22"/>
         </w:rPr>
-        <w:t>Из G1–G3 убран ключ «морская рыбалка сириус -порт -групповой -катер».</w:t>
-      </w:r>
-    </w:p>
-    <w:p>
-      <w:pPr>
-        <w:pStyle w:val="Heading1"/>
-      </w:pPr>
-      <w:r>
-        <w:t>Сначала эти пункты</w:t>
-      </w:r>
-    </w:p>
-    <w:p>
-      <w:pPr>
-        <w:pStyle w:val="ListBullet"/>
-        <w:spacing w:after="60"/>
-      </w:pPr>
-      <w:r>
-        <w:rPr>
-          <w:rFonts w:ascii="Calibri" w:hAnsi="Calibri"/>
-          <w:b/>
-          <w:sz w:val="22"/>
-        </w:rPr>
-        <w:t>Расписание.</w:t>
-      </w:r>
-      <w:r>
-        <w:rPr>
-          <w:rFonts w:ascii="Calibri" w:hAnsi="Calibri"/>
-          <w:sz w:val="22"/>
-        </w:rPr>
-        <w:t xml:space="preserve"> В объявлениях два выхода, 12:00 и 15:00. На странице по-прежнему три: 9:00, 12:00 и 15:00. Рядом написано «уточняйте, бывают изменения», но девять утра на странице стоит.</w:t>
-      </w:r>
-    </w:p>
-    <w:p>
-      <w:pPr>
-        <w:pStyle w:val="ListBullet"/>
-        <w:spacing w:after="60"/>
-      </w:pPr>
-      <w:r>
-        <w:rPr>
-          <w:rFonts w:ascii="Calibri" w:hAnsi="Calibri"/>
-          <w:b/>
-          <w:sz w:val="22"/>
-        </w:rPr>
-        <w:t>Два телефона.</w:t>
-      </w:r>
-      <w:r>
-        <w:rPr>
-          <w:rFonts w:ascii="Calibri" w:hAnsi="Calibri"/>
-          <w:sz w:val="22"/>
-        </w:rPr>
-        <w:t xml:space="preserve"> Кнопка в шапке сайта и ссылка «Забронировать» ведут на +7 918 304-40-00. Внизу страницы и в карточке организации, откуда Директ берёт звонок и Карты, номер +7 917 675-05-55.</w:t>
-      </w:r>
-    </w:p>
-    <w:p>
-      <w:pPr>
-        <w:pStyle w:val="ListBullet"/>
-        <w:spacing w:after="60"/>
-      </w:pPr>
-      <w:r>
-        <w:rPr>
-          <w:rFonts w:ascii="Calibri" w:hAnsi="Calibri"/>
-          <w:b/>
-          <w:sz w:val="22"/>
-        </w:rPr>
-        <w:t>Яхта уходит в групповой билет.</w:t>
-      </w:r>
-      <w:r>
-        <w:rPr>
-          <w:rFonts w:ascii="Calibri" w:hAnsi="Calibri"/>
-          <w:sz w:val="22"/>
-        </w:rPr>
-        <w:t xml:space="preserve"> Запрос «рыбалка с яхты сочи» ловит G10 и показывает групповой катамаран за 2 800 ₽. В G1–G3, G5 и G9 стоит минус «-яхты», поэтому трофей и остальные группы этот запрос не берут.</w:t>
-      </w:r>
-    </w:p>
-    <w:p>
-      <w:pPr>
-        <w:pStyle w:val="ListBullet"/>
-        <w:spacing w:after="60"/>
-      </w:pPr>
-      <w:r>
-        <w:rPr>
-          <w:rFonts w:ascii="Calibri" w:hAnsi="Calibri"/>
-          <w:b/>
-          <w:sz w:val="22"/>
-        </w:rPr>
-        <w:t>Сезон не виден туристам.</w:t>
-      </w:r>
-      <w:r>
-        <w:rPr>
-          <w:rFonts w:ascii="Calibri" w:hAnsi="Calibri"/>
-          <w:sz w:val="22"/>
-        </w:rPr>
-        <w:t xml:space="preserve"> Ключи ставриды, кефали и саргана лежат в G5, а география G5 только Краснодарский край. Запрос из Москвы «рыбалка на ставриду сочи» в ключ не попадает и может прийти лишь широким автотаргетингом G1–G3.</w:t>
-      </w:r>
-    </w:p>
-    <w:p>
-      <w:pPr>
-        <w:pStyle w:val="ListBullet"/>
-        <w:spacing w:after="60"/>
-      </w:pPr>
-      <w:r>
-        <w:rPr>
-          <w:rFonts w:ascii="Calibri" w:hAnsi="Calibri"/>
-          <w:b/>
-          <w:sz w:val="22"/>
-        </w:rPr>
-        <w:t>Время клёва и слоты.</w:t>
-      </w:r>
-      <w:r>
-        <w:rPr>
-          <w:rFonts w:ascii="Calibri" w:hAnsi="Calibri"/>
-          <w:sz w:val="22"/>
-        </w:rPr>
-        <w:t xml:space="preserve"> На карточке ставриды на сайте лучшее время клёва указано как раннее утро или вечер. Рабочие слоты объявления дневные: 12:00 и 15:00.</w:t>
-      </w:r>
-    </w:p>
-    <w:p>
-      <w:pPr>
-        <w:pStyle w:val="Heading1"/>
-      </w:pPr>
-      <w:r>
-        <w:t>Сайт и адреса</w:t>
-      </w:r>
-    </w:p>
-    <w:p>
-      <w:r>
-        <w:rPr>
-          <w:rFonts w:ascii="Calibri" w:hAnsi="Calibri"/>
-          <w:b w:val="0"/>
-          <w:sz w:val="22"/>
-        </w:rPr>
-        <w:t>Цена 2 800 ₽, 3 часа, до 8 человек, снасти, готовка улова и трофей от 20 000 ₽ сходятся со ссылками. Адрес внизу страницы: улица Голубая, 1, Имеретинский порт, линия 2. Улицы Парусная на странице нет.</w:t>
-      </w:r>
-    </w:p>
-    <w:tbl>
-      <w:tblPr>
-        <w:tblStyle w:val="TableGrid"/>
-        <w:tblW w:type="auto" w:w="0"/>
-        <w:tblLook w:firstColumn="1" w:firstRow="1" w:lastColumn="0" w:lastRow="0" w:noHBand="0" w:noVBand="1" w:val="04A0"/>
-      </w:tblPr>
-      <w:tblGrid>
-        <w:gridCol w:w="3324"/>
-        <w:gridCol w:w="3324"/>
-        <w:gridCol w:w="3324"/>
-      </w:tblGrid>
-      <w:tr>
-        <w:tc>
-          <w:tcPr>
-            <w:tcW w:type="dxa" w:w="3324"/>
-          </w:tcPr>
-          <w:p>
-            <w:r/>
-            <w:r>
-              <w:rPr>
-                <w:rFonts w:ascii="Calibri" w:hAnsi="Calibri"/>
-                <w:b/>
-                <w:sz w:val="20"/>
-              </w:rPr>
-              <w:t>Где</w:t>
-            </w:r>
-          </w:p>
-        </w:tc>
-        <w:tc>
-          <w:tcPr>
-            <w:tcW w:type="dxa" w:w="3324"/>
-          </w:tcPr>
-          <w:p>
-            <w:r/>
-            <w:r>
-              <w:rPr>
-                <w:rFonts w:ascii="Calibri" w:hAnsi="Calibri"/>
-                <w:b/>
-                <w:sz w:val="20"/>
-              </w:rPr>
-              <w:t>Что написано</w:t>
-            </w:r>
-          </w:p>
-        </w:tc>
-        <w:tc>
-          <w:tcPr>
-            <w:tcW w:type="dxa" w:w="3324"/>
-          </w:tcPr>
-          <w:p>
-            <w:r/>
-            <w:r>
-              <w:rPr>
-                <w:rFonts w:ascii="Calibri" w:hAnsi="Calibri"/>
-                <w:b/>
-                <w:sz w:val="20"/>
-              </w:rPr>
-              <w:t>С чем расходится</w:t>
-            </w:r>
-          </w:p>
-        </w:tc>
-      </w:tr>
-      <w:tr>
-        <w:tc>
-          <w:tcPr>
-            <w:tcW w:type="dxa" w:w="3324"/>
-          </w:tcPr>
-          <w:p>
-            <w:r/>
-            <w:r>
-              <w:rPr>
-                <w:rFonts w:ascii="Calibri" w:hAnsi="Calibri"/>
-                <w:sz w:val="20"/>
-              </w:rPr>
-              <w:t>Страница, блок выхода</w:t>
-            </w:r>
-          </w:p>
-        </w:tc>
-        <w:tc>
-          <w:tcPr>
-            <w:tcW w:type="dxa" w:w="3324"/>
-          </w:tcPr>
-          <w:p>
-            <w:r/>
-            <w:r>
-              <w:rPr>
-                <w:rFonts w:ascii="Calibri" w:hAnsi="Calibri"/>
-                <w:sz w:val="20"/>
-              </w:rPr>
-              <w:t>9:00, 12:00 и 15:00</w:t>
-            </w:r>
-          </w:p>
-        </w:tc>
-        <w:tc>
-          <w:tcPr>
-            <w:tcW w:type="dxa" w:w="3324"/>
-          </w:tcPr>
-          <w:p>
-            <w:r/>
-            <w:r>
-              <w:rPr>
-                <w:rFonts w:ascii="Calibri" w:hAnsi="Calibri"/>
-                <w:sz w:val="20"/>
-              </w:rPr>
-              <w:t>Объявления и ссылка G5: только 12:00 и 15:00</w:t>
-            </w:r>
-          </w:p>
-        </w:tc>
-      </w:tr>
-      <w:tr>
-        <w:tc>
-          <w:tcPr>
-            <w:tcW w:type="dxa" w:w="3324"/>
-          </w:tcPr>
-          <w:p>
-            <w:r/>
-            <w:r>
-              <w:rPr>
-                <w:rFonts w:ascii="Calibri" w:hAnsi="Calibri"/>
-                <w:sz w:val="20"/>
-              </w:rPr>
-              <w:t>Карточка ставриды</w:t>
-            </w:r>
-          </w:p>
-        </w:tc>
-        <w:tc>
-          <w:tcPr>
-            <w:tcW w:type="dxa" w:w="3324"/>
-          </w:tcPr>
-          <w:p>
-            <w:r/>
-            <w:r>
-              <w:rPr>
-                <w:rFonts w:ascii="Calibri" w:hAnsi="Calibri"/>
-                <w:sz w:val="20"/>
-              </w:rPr>
-              <w:t>Лучший клёв рано утром или вечером</w:t>
-            </w:r>
-          </w:p>
-        </w:tc>
-        <w:tc>
-          <w:tcPr>
-            <w:tcW w:type="dxa" w:w="3324"/>
-          </w:tcPr>
-          <w:p>
-            <w:r/>
-            <w:r>
-              <w:rPr>
-                <w:rFonts w:ascii="Calibri" w:hAnsi="Calibri"/>
-                <w:sz w:val="20"/>
-              </w:rPr>
-              <w:t>Слоты 12:00 и 15:00</w:t>
-            </w:r>
-          </w:p>
-        </w:tc>
-      </w:tr>
-      <w:tr>
-        <w:tc>
-          <w:tcPr>
-            <w:tcW w:type="dxa" w:w="3324"/>
-          </w:tcPr>
-          <w:p>
-            <w:r/>
-            <w:r>
-              <w:rPr>
-                <w:rFonts w:ascii="Calibri" w:hAnsi="Calibri"/>
-                <w:sz w:val="20"/>
-              </w:rPr>
-              <w:t>Шапка и ссылка «Забронировать»</w:t>
-            </w:r>
-          </w:p>
-        </w:tc>
-        <w:tc>
-          <w:tcPr>
-            <w:tcW w:type="dxa" w:w="3324"/>
-          </w:tcPr>
-          <w:p>
-            <w:r/>
-            <w:r>
-              <w:rPr>
-                <w:rFonts w:ascii="Calibri" w:hAnsi="Calibri"/>
-                <w:sz w:val="20"/>
-              </w:rPr>
-              <w:t>+7 918 304-40-00</w:t>
-            </w:r>
-          </w:p>
-        </w:tc>
-        <w:tc>
-          <w:tcPr>
-            <w:tcW w:type="dxa" w:w="3324"/>
-          </w:tcPr>
-          <w:p>
-            <w:r/>
-            <w:r>
-              <w:rPr>
-                <w:rFonts w:ascii="Calibri" w:hAnsi="Calibri"/>
-                <w:sz w:val="20"/>
-              </w:rPr>
-              <w:t>Низ страницы и звонок из объявления: +7 917 675-05-55</w:t>
-            </w:r>
-          </w:p>
-        </w:tc>
-      </w:tr>
-      <w:tr>
-        <w:tc>
-          <w:tcPr>
-            <w:tcW w:type="dxa" w:w="3324"/>
-          </w:tcPr>
-          <w:p>
-            <w:r/>
-            <w:r>
-              <w:rPr>
-                <w:rFonts w:ascii="Calibri" w:hAnsi="Calibri"/>
-                <w:sz w:val="20"/>
-              </w:rPr>
-              <w:t>Ссылка G5 «Причал»</w:t>
-            </w:r>
-          </w:p>
-        </w:tc>
-        <w:tc>
-          <w:tcPr>
-            <w:tcW w:type="dxa" w:w="3324"/>
-          </w:tcPr>
-          <w:p>
-            <w:r/>
-            <w:r>
-              <w:rPr>
-                <w:rFonts w:ascii="Calibri" w:hAnsi="Calibri"/>
-                <w:sz w:val="20"/>
-              </w:rPr>
-              <w:t>Имеретинский порт, Голубая, 1</w:t>
-            </w:r>
-          </w:p>
-        </w:tc>
-        <w:tc>
-          <w:tcPr>
-            <w:tcW w:type="dxa" w:w="3324"/>
-          </w:tcPr>
-          <w:p>
-            <w:r/>
-            <w:r>
-              <w:rPr>
-                <w:rFonts w:ascii="Calibri" w:hAnsi="Calibri"/>
-                <w:sz w:val="20"/>
-              </w:rPr>
-              <w:t>Совпадает с низом страницы</w:t>
-            </w:r>
-          </w:p>
-        </w:tc>
-      </w:tr>
-      <w:tr>
-        <w:tc>
-          <w:tcPr>
-            <w:tcW w:type="dxa" w:w="3324"/>
-          </w:tcPr>
-          <w:p>
-            <w:r/>
-            <w:r>
-              <w:rPr>
-                <w:rFonts w:ascii="Calibri" w:hAnsi="Calibri"/>
-                <w:sz w:val="20"/>
-              </w:rPr>
-              <w:t>Ссылки кампании для G1–G3 и G10</w:t>
-            </w:r>
-          </w:p>
-        </w:tc>
-        <w:tc>
-          <w:tcPr>
-            <w:tcW w:type="dxa" w:w="3324"/>
-          </w:tcPr>
-          <w:p>
-            <w:r/>
-            <w:r>
-              <w:rPr>
-                <w:rFonts w:ascii="Calibri" w:hAnsi="Calibri"/>
-                <w:sz w:val="20"/>
-              </w:rPr>
-              <w:t>Раньше там была Парусная, 1</w:t>
-            </w:r>
-          </w:p>
-        </w:tc>
-        <w:tc>
-          <w:tcPr>
-            <w:tcW w:type="dxa" w:w="3324"/>
-          </w:tcPr>
-          <w:p>
-            <w:r/>
-            <w:r>
-              <w:rPr>
-                <w:rFonts w:ascii="Calibri" w:hAnsi="Calibri"/>
-                <w:sz w:val="20"/>
-              </w:rPr>
-              <w:t>Этой улицы на странице нет. Если ссылку кампании не меняли, в этих группах чужой адрес</w:t>
-            </w:r>
-          </w:p>
-        </w:tc>
-      </w:tr>
-      <w:tr>
-        <w:tc>
-          <w:tcPr>
-            <w:tcW w:type="dxa" w:w="3324"/>
-          </w:tcPr>
-          <w:p>
-            <w:r/>
-            <w:r>
-              <w:rPr>
-                <w:rFonts w:ascii="Calibri" w:hAnsi="Calibri"/>
-                <w:sz w:val="20"/>
-              </w:rPr>
-              <w:t>Карты</w:t>
-            </w:r>
-          </w:p>
-        </w:tc>
-        <w:tc>
-          <w:tcPr>
-            <w:tcW w:type="dxa" w:w="3324"/>
-          </w:tcPr>
-          <w:p>
-            <w:r/>
-            <w:r>
-              <w:rPr>
-                <w:rFonts w:ascii="Calibri" w:hAnsi="Calibri"/>
-                <w:sz w:val="20"/>
-              </w:rPr>
-              <w:t>Организация «Яхты Сириуса», Голубая, 1</w:t>
-            </w:r>
-          </w:p>
-        </w:tc>
-        <w:tc>
-          <w:tcPr>
-            <w:tcW w:type="dxa" w:w="3324"/>
-          </w:tcPr>
-          <w:p>
-            <w:r/>
-            <w:r>
-              <w:rPr>
-                <w:rFonts w:ascii="Calibri" w:hAnsi="Calibri"/>
-                <w:sz w:val="20"/>
-              </w:rPr>
-              <w:t>Человек из Карт попадает в офис, не к трапу. Причал назван в быстрой ссылке</w:t>
-            </w:r>
-          </w:p>
-        </w:tc>
-      </w:tr>
-    </w:tbl>
-    <w:p/>
-    <w:p>
-      <w:r>
-        <w:rPr>
-          <w:rFonts w:ascii="Calibri" w:hAnsi="Calibri"/>
-          <w:b w:val="0"/>
-          <w:sz w:val="22"/>
-        </w:rPr>
-        <w:t>С 1 декабря по 30 апреля кефаль нельзя брать внутри Имеретинского порта и с оградительных молов. В море за линией порта можно. Ссылка про ноябрь–декабрь кефаль не запрещает, если ловят не в акватории порта.</w:t>
-      </w:r>
-    </w:p>
-    <w:p>
-      <w:pPr>
-        <w:pStyle w:val="Heading1"/>
-      </w:pPr>
-      <w:r>
-        <w:t>Минус-фразы кампании</w:t>
-      </w:r>
-    </w:p>
-    <w:p>
-      <w:r>
-        <w:rPr>
-          <w:rFonts w:ascii="Calibri" w:hAnsi="Calibri"/>
-          <w:b w:val="0"/>
-          <w:sz w:val="22"/>
-        </w:rPr>
-        <w:t>«-корабль», «-лазаревск» рядом с «-лазаревское» и «-петербург» стоят правильно. «-инструктор» снят. Запрещённые площадки по-прежнему про игры, биржи и справочники, к рыбалке не относятся.</w:t>
+        <w:t>В одном тексте G5 названы только ставрида и кефаль. Сарган есть в заголовке «Групповая рыбалка в ноябре» и в сезонной ссылке. Пока Директ не подставит этот заголовок, объявление саргана не называет.</w:t>
       </w:r>
     </w:p>
     <w:p>
@@ -621,7 +117,7 @@
           <w:rFonts w:ascii="Calibri" w:hAnsi="Calibri"/>
           <w:sz w:val="22"/>
         </w:rPr>
-        <w:t>«-купить» остался. Он режет «купить билет» и «купить тур на рыбалку». Если так и задумано, пусть стоит.</w:t>
+        <w:t>Текст «Не бронируйте весь катер…» стоит в G5 и предлагался для групповых объявлений. Он начинается с отказа. Замена — в конце файла.</w:t>
       </w:r>
     </w:p>
     <w:p>
@@ -634,7 +130,7 @@
           <w:rFonts w:ascii="Calibri" w:hAnsi="Calibri"/>
           <w:sz w:val="22"/>
         </w:rPr>
-        <w:t>Нет отдельного «-кемер»: Турция закрыта, Кемер нет. Нет связки «-морской порт»: есть «морпорт сочи» и «сочинский порт».</w:t>
+        <w:t>На сезонной группе G5 висит ссылка «Трофейная рыбалка» от 20 000 ₽. Минуса группы пускают туда только с объявления билета 2 800 ₽.</w:t>
       </w:r>
     </w:p>
     <w:p>
@@ -647,25 +143,7 @@
           <w:rFonts w:ascii="Calibri" w:hAnsi="Calibri"/>
           <w:sz w:val="22"/>
         </w:rPr>
-        <w:t>«-имеретинский морской порт» режет только три слова сразу. Ключи «рыбалка на имеретинском порту» и «рыбалка имеретинский порт» живы.</w:t>
-      </w:r>
-    </w:p>
-    <w:p>
-      <w:pPr>
-        <w:pStyle w:val="Heading1"/>
-      </w:pPr>
-      <w:r>
-        <w:t>Группа G1–G3</w:t>
-      </w:r>
-    </w:p>
-    <w:p>
-      <w:r>
-        <w:rPr>
-          <w:rFonts w:ascii="Calibri" w:hAnsi="Calibri"/>
-          <w:b w:val="0"/>
-          <w:sz w:val="22"/>
-        </w:rPr>
-        <w:t>География Россия. Автотаргетинг прежний: целевые, узкие и широкие включены, сопутствующие, альтернативные и чужие бренды выключены. Ссылки как у кампании.</w:t>
+        <w:t>В G9 ссылка «Групповой билет на рыбалку» за 2 800 ₽ стоит на трофейном объявлении и уводит на другой формат.</w:t>
       </w:r>
     </w:p>
     <w:p>
@@ -678,7 +156,7 @@
           <w:rFonts w:ascii="Calibri" w:hAnsi="Calibri"/>
           <w:sz w:val="22"/>
         </w:rPr>
-        <w:t>Минус «-яхты» закрывает «рыбалка на яхте» и название «Яхты Сириуса». Такой запрос забирает G10.</w:t>
+        <w:t>Ключ G10 «рыбалка с яхты сочи» показывает групповой катамаран за 2 800 ₽. В G1–G3, G5 и G9 запрос закрыт минусом «-яхты». Лодка — катамаран, не яхта.</w:t>
       </w:r>
     </w:p>
     <w:p>
@@ -691,7 +169,7 @@
           <w:rFonts w:ascii="Calibri" w:hAnsi="Calibri"/>
           <w:sz w:val="22"/>
         </w:rPr>
-        <w:t>Минуса «-трофейная», «-катран» и «-скат» отдают трофей в G9. На объявлении при этом может висеть ссылка «Трофейная рыбалка», если группа берёт ссылки кампании.</w:t>
+        <w:t>Ключ G10 «рыбалка хоста море» ищет рыбалку в Хосте. Выход из Имеретинского порта в открытое море.</w:t>
       </w:r>
     </w:p>
     <w:p>
@@ -704,7 +182,7 @@
           <w:rFonts w:ascii="Calibri" w:hAnsi="Calibri"/>
           <w:sz w:val="22"/>
         </w:rPr>
-        <w:t>Запрос «морская рыбалка на катере сириус» ключом не закрыт: остался только «с катера». Его может взять автотаргетинг.</w:t>
+        <w:t>Ключ G10 «"рыбалка в черном море"» ловит запрос без города, по всему берегу. Крым, Геленджик, Анапа и Туапсе минусами закрыты, сам запрос без города нет.</w:t>
       </w:r>
     </w:p>
     <w:p>
@@ -717,7 +195,7 @@
           <w:rFonts w:ascii="Calibri" w:hAnsi="Calibri"/>
           <w:sz w:val="22"/>
         </w:rPr>
-        <w:t>Ключей на ставриду, кефаль и сарган нет. Для человека не из Краснодарского края это единственная группа на групповой билет, и сезонная рыба в ней не названа в ключах.</w:t>
+        <w:t>В G1–G3 нет ключей на ставриду, кефаль и сарган. G5 с этими ключами ограничена Краснодарским краем, запрос из Москвы в неё не попадает. Фразы для вставки — в конце файла. Внутри края те же фразы уже есть в G5, группы будут делить эти показы.</w:t>
       </w:r>
     </w:p>
     <w:p>
@@ -730,7 +208,7 @@
           <w:rFonts w:ascii="Calibri" w:hAnsi="Calibri"/>
           <w:sz w:val="22"/>
         </w:rPr>
-        <w:t>Текст «Не бронируйте весь катер…» начинается с отказа. Директ его принимает, смысл лучше развернуть в приглашение занять место в группе.</w:t>
+        <w:t>Интересы G10, если это условие показа, а не наценка, отсекут человека без метки рыбака. В списке есть чужие сайты boatfishing-sochi.ru и rental-yacht.ru.</w:t>
       </w:r>
     </w:p>
     <w:p>
@@ -738,7 +216,7 @@
         <w:pStyle w:val="Heading1"/>
       </w:pPr>
       <w:r>
-        <w:t>Группа G5</w:t>
+        <w:t>Текст вместо «Не бронируйте весь катер…»</w:t>
       </w:r>
     </w:p>
     <w:p>
@@ -748,72 +226,7 @@
           <w:b w:val="0"/>
           <w:sz w:val="22"/>
         </w:rPr>
-        <w:t>География только Краснодарский край. Свои быстрые ссылки. Сезон в ссылке верный: ноябрь/декабрь, ставрида, кефаль, сарган. Расписание в ссылке верное: 12:00 и 15:00, 3 часа. Телефон в ссылке 918 304-40-00. Причал в ссылке: Голубая, 1, это совпадает с низом страницы.</w:t>
-      </w:r>
-    </w:p>
-    <w:p>
-      <w:pPr>
-        <w:pStyle w:val="ListBullet"/>
-        <w:spacing w:after="60"/>
-      </w:pPr>
-      <w:r>
-        <w:rPr>
-          <w:rFonts w:ascii="Calibri" w:hAnsi="Calibri"/>
-          <w:sz w:val="22"/>
-        </w:rPr>
-        <w:t>Заголовок «3 часа рыбалки в море с катамарана - слоты каждый день,» заканчивается запятой. Слово «слоты» для гостя хуже, чем «выходы».</w:t>
-      </w:r>
-    </w:p>
-    <w:p>
-      <w:pPr>
-        <w:pStyle w:val="ListBullet"/>
-        <w:spacing w:after="60"/>
-      </w:pPr>
-      <w:r>
-        <w:rPr>
-          <w:rFonts w:ascii="Calibri" w:hAnsi="Calibri"/>
-          <w:sz w:val="22"/>
-        </w:rPr>
-        <w:t>В одном тексте названы только ставрида и кефаль. Сарган есть в заголовке «Групповая рыбалка в ноябре» и в ссылке. Директ собирает комбинации сам, противоречия здесь нет.</w:t>
-      </w:r>
-    </w:p>
-    <w:p>
-      <w:pPr>
-        <w:pStyle w:val="ListBullet"/>
-        <w:spacing w:after="60"/>
-      </w:pPr>
-      <w:r>
-        <w:rPr>
-          <w:rFonts w:ascii="Calibri" w:hAnsi="Calibri"/>
-          <w:sz w:val="22"/>
-        </w:rPr>
-        <w:t>Ссылка «Трофейная рыбалка» висит на сезонной группе билета 2 800 ₽. Минуса группы трофейный запрос в G5 не пускают, но с группового объявления на трофей уйти можно.</w:t>
-      </w:r>
-    </w:p>
-    <w:p>
-      <w:pPr>
-        <w:pStyle w:val="ListBullet"/>
-        <w:spacing w:after="60"/>
-      </w:pPr>
-      <w:r>
-        <w:rPr>
-          <w:rFonts w:ascii="Calibri" w:hAnsi="Calibri"/>
-          <w:sz w:val="22"/>
-        </w:rPr>
-        <w:t>Короткие ключи с «-рыбалка -ловля» ловят «ставрида сочи» без слова «рыбалка». Часть таких запросов про магазин и кухню. Кафе, ресторан, купить и рынок часть закрывают.</w:t>
-      </w:r>
-    </w:p>
-    <w:p>
-      <w:pPr>
-        <w:pStyle w:val="ListBullet"/>
-        <w:spacing w:after="60"/>
-      </w:pPr>
-      <w:r>
-        <w:rPr>
-          <w:rFonts w:ascii="Calibri" w:hAnsi="Calibri"/>
-          <w:sz w:val="22"/>
-        </w:rPr>
-        <w:t>Минус «-яхты» тот же, что в G1–G3. «-луфаря» здесь уместен.</w:t>
+        <w:t>Займите место в группе: катамаран "Моряк Попай", 2800 ₽, до 8 человек.</w:t>
       </w:r>
     </w:p>
     <w:p>
@@ -821,7 +234,7 @@
         <w:pStyle w:val="Heading1"/>
       </w:pPr>
       <w:r>
-        <w:t>Группа G9</w:t>
+        <w:t>Ключи ставриды, кефали и саргана для G1–G3</w:t>
       </w:r>
     </w:p>
     <w:p>
@@ -831,292 +244,546 @@
           <w:b w:val="0"/>
           <w:sz w:val="22"/>
         </w:rPr>
-        <w:t>Трофей и катамаран целиком, от 20 000 ₽, от 3 часов. География Россия. Минус «-рыбалка» снят, ключи со словом «рыбалка» снова рабочие. Минуса «-группа», «-групповая», «-билет» и «-!за человека» по-прежнему отделяют трофей от билета 2 800 ₽. Цены 1800, 2300, 2500 и 2800 из минусов убраны: запрос с ценой группового билета, но без слов «группа» и «билет», может прилипнуть широким автотаргетингом.</w:t>
+        <w:t>География группы уже Россия, отдельные города в ключах не режутся минусами кампании. Коротких фраз без слова «рыбалка» здесь нет: они тянут магазин и кухню.</w:t>
+      </w:r>
+    </w:p>
+    <w:p>
+      <w:r>
+        <w:rPr>
+          <w:rFonts w:ascii="Calibri" w:hAnsi="Calibri"/>
+          <w:b/>
+          <w:sz w:val="22"/>
+        </w:rPr>
+        <w:t>Ставрида</w:t>
       </w:r>
     </w:p>
     <w:p>
       <w:pPr>
-        <w:pStyle w:val="ListBullet"/>
-        <w:spacing w:after="60"/>
+        <w:spacing w:after="0" w:before="0"/>
       </w:pPr>
       <w:r>
         <w:rPr>
           <w:rFonts w:ascii="Calibri" w:hAnsi="Calibri"/>
           <w:sz w:val="22"/>
         </w:rPr>
-        <w:t>В тексте объявления названы скат, ставрида и кефаль, а минус «-ставрида» не пускает запрос про ставриду в эту группу. На объявлении про ската ставрида может остаться как прилов.</w:t>
+        <w:t>рыбалка на ставриду в черном море</w:t>
       </w:r>
     </w:p>
     <w:p>
       <w:pPr>
-        <w:pStyle w:val="ListBullet"/>
-        <w:spacing w:after="60"/>
+        <w:spacing w:after="0" w:before="0"/>
       </w:pPr>
       <w:r>
         <w:rPr>
           <w:rFonts w:ascii="Calibri" w:hAnsi="Calibri"/>
           <w:sz w:val="22"/>
         </w:rPr>
-        <w:t>Минус «-яхты» снова режет «Яхты Сириуса» и «рыбалка на яхте». Этот спрос уходит в G10, на билет 2 800 ₽.</w:t>
+        <w:t>рыбалка на ставриду в открытом море</w:t>
       </w:r>
     </w:p>
     <w:p>
       <w:pPr>
-        <w:pStyle w:val="ListBullet"/>
-        <w:spacing w:after="60"/>
+        <w:spacing w:after="0" w:before="0"/>
       </w:pPr>
       <w:r>
         <w:rPr>
           <w:rFonts w:ascii="Calibri" w:hAnsi="Calibri"/>
           <w:sz w:val="22"/>
         </w:rPr>
-        <w:t>Минус «-парусная» режет слово «парусная». На сайте причал записан как Голубая, 1, поэтому адрес выхода этот минус не гасит.</w:t>
+        <w:t>рыбалка на ставриду сочи</w:t>
       </w:r>
     </w:p>
     <w:p>
       <w:pPr>
-        <w:pStyle w:val="ListBullet"/>
-        <w:spacing w:after="60"/>
+        <w:spacing w:after="0" w:before="0"/>
       </w:pPr>
       <w:r>
         <w:rPr>
           <w:rFonts w:ascii="Calibri" w:hAnsi="Calibri"/>
           <w:sz w:val="22"/>
         </w:rPr>
-        <w:t>Минус «-стоимость катамарана» снят. Запрос про цену аренды снова может найти группу.</w:t>
+        <w:t>рыбалка на ставриду сириус</w:t>
       </w:r>
     </w:p>
     <w:p>
       <w:pPr>
-        <w:pStyle w:val="ListBullet"/>
-        <w:spacing w:after="60"/>
+        <w:spacing w:after="0" w:before="0"/>
       </w:pPr>
       <w:r>
         <w:rPr>
           <w:rFonts w:ascii="Calibri" w:hAnsi="Calibri"/>
           <w:sz w:val="22"/>
         </w:rPr>
-        <w:t>Ключ «индивидуальная рыбалка сириус» по-прежнему повторён, один раз с «-морской».</w:t>
+        <w:t>рыбалка на ставриду адлер</w:t>
       </w:r>
     </w:p>
     <w:p>
       <w:pPr>
-        <w:pStyle w:val="ListBullet"/>
-        <w:spacing w:after="60"/>
+        <w:spacing w:after="0" w:before="0"/>
       </w:pPr>
       <w:r>
         <w:rPr>
           <w:rFonts w:ascii="Calibri" w:hAnsi="Calibri"/>
           <w:sz w:val="22"/>
         </w:rPr>
-        <w:t>В уточнении, если его не меняли, написано «картан и скат». Катран это другой вид. На сайте трофей: морской кот и морская лисица.</w:t>
+        <w:t>рыбалка на ставриду с катера сочи</w:t>
       </w:r>
     </w:p>
     <w:p>
       <w:pPr>
-        <w:pStyle w:val="ListBullet"/>
-        <w:spacing w:after="60"/>
+        <w:spacing w:after="0" w:before="0"/>
       </w:pPr>
       <w:r>
         <w:rPr>
           <w:rFonts w:ascii="Calibri" w:hAnsi="Calibri"/>
           <w:sz w:val="22"/>
         </w:rPr>
-        <w:t>В ссылке брони, если её не меняли, опечатка «мессенждер». В ссылках G5 написано правильно: «мессенджер».</w:t>
+        <w:t>рыбалка на ставриду с катера сириус</w:t>
       </w:r>
     </w:p>
     <w:p>
       <w:pPr>
-        <w:pStyle w:val="ListBullet"/>
-        <w:spacing w:after="60"/>
+        <w:spacing w:after="0" w:before="0"/>
       </w:pPr>
       <w:r>
         <w:rPr>
           <w:rFonts w:ascii="Calibri" w:hAnsi="Calibri"/>
           <w:sz w:val="22"/>
         </w:rPr>
-        <w:t>Ссылка «Групповой билет 2 800 ₽» стоит внутри трофейной группы и уводит на другой формат.</w:t>
+        <w:t>ловля ставриды сочи</w:t>
       </w:r>
     </w:p>
     <w:p>
       <w:pPr>
-        <w:pStyle w:val="Heading1"/>
-      </w:pPr>
-      <w:r>
-        <w:t>Группа G10</w:t>
-      </w:r>
-    </w:p>
-    <w:p>
-      <w:r>
-        <w:rPr>
-          <w:rFonts w:ascii="Calibri" w:hAnsi="Calibri"/>
-          <w:b w:val="0"/>
-          <w:sz w:val="22"/>
-        </w:rPr>
-        <w:t>Широкая морская рыбалка, групповой билет, география Россия. Ссылки как у кампании. Цена конверсии группы +5%, аудитория «Просмотр сайта» +10%.</w:t>
-      </w:r>
-    </w:p>
-    <w:p>
-      <w:pPr>
-        <w:pStyle w:val="ListBullet"/>
-        <w:spacing w:after="60"/>
+        <w:spacing w:after="0" w:before="0"/>
       </w:pPr>
       <w:r>
         <w:rPr>
           <w:rFonts w:ascii="Calibri" w:hAnsi="Calibri"/>
           <w:sz w:val="22"/>
         </w:rPr>
-        <w:t>«рыбалка хоста море» живой. Дагомыс и Лоо отсечены, Хоста нет. Человек ищет рыбалку в Хосте, выход из Имеретинского порта.</w:t>
+        <w:t>ловля ставриды сириус</w:t>
       </w:r>
     </w:p>
     <w:p>
       <w:pPr>
-        <w:pStyle w:val="ListBullet"/>
-        <w:spacing w:after="60"/>
+        <w:spacing w:after="0" w:before="0"/>
       </w:pPr>
       <w:r>
         <w:rPr>
           <w:rFonts w:ascii="Calibri" w:hAnsi="Calibri"/>
           <w:sz w:val="22"/>
         </w:rPr>
-        <w:t>«рыбалка с яхты сочи» живой и ведёт на катамаран за 2 800 ₽. В остальных группах «-яхты» этот запрос закрывает.</w:t>
+        <w:t>ставрида сочи ноябрь</w:t>
       </w:r>
     </w:p>
     <w:p>
       <w:pPr>
-        <w:pStyle w:val="ListBullet"/>
-        <w:spacing w:after="60"/>
+        <w:spacing w:after="0" w:before="0"/>
       </w:pPr>
       <w:r>
         <w:rPr>
           <w:rFonts w:ascii="Calibri" w:hAnsi="Calibri"/>
           <w:sz w:val="22"/>
         </w:rPr>
-        <w:t>«"рыбалка в черном море"» в кавычках ловит весь берег, не только Сочи. Крым, Геленджик, Анапа и Туапсе минусами закрыты, запрос без города нет.</w:t>
+        <w:t>ставрида сочи декабрь</w:t>
       </w:r>
     </w:p>
     <w:p>
       <w:pPr>
-        <w:pStyle w:val="ListBullet"/>
-        <w:spacing w:after="60"/>
+        <w:spacing w:after="0" w:before="0"/>
       </w:pPr>
       <w:r>
         <w:rPr>
           <w:rFonts w:ascii="Calibri" w:hAnsi="Calibri"/>
           <w:sz w:val="22"/>
         </w:rPr>
-        <w:t>Минуса «-трофейная», «-трофей», «-целиком», «-индивидуальная», «-20000» и «-20 000» правильно отдают трофей в G9.</w:t>
+        <w:t>морская рыбалка сочи ставрида</w:t>
       </w:r>
     </w:p>
     <w:p>
       <w:pPr>
-        <w:pStyle w:val="ListBullet"/>
-        <w:spacing w:after="60"/>
+        <w:spacing w:after="0" w:before="0"/>
       </w:pPr>
       <w:r>
         <w:rPr>
           <w:rFonts w:ascii="Calibri" w:hAnsi="Calibri"/>
           <w:sz w:val="22"/>
         </w:rPr>
-        <w:t>Интересы и привычки: «Рыбалка», «Отдых в Сочи», рыболовные сайты и приложения, среди них boatfishing-sochi.ru и rental-yacht.ru. Если это условие показа, а не наценка, человек без метки рыбака объявление не увидит.</w:t>
+        <w:t>морская рыбалка на ставриду</w:t>
       </w:r>
     </w:p>
     <w:p>
       <w:pPr>
-        <w:pStyle w:val="ListBullet"/>
-        <w:spacing w:after="60"/>
+        <w:spacing w:after="0" w:before="0"/>
       </w:pPr>
       <w:r>
         <w:rPr>
           <w:rFonts w:ascii="Calibri" w:hAnsi="Calibri"/>
           <w:sz w:val="22"/>
         </w:rPr>
-        <w:t>Тексты обещают ставриду и кефаль, слоты 12:00 и 15:00. Сарган в текстах G10 не назван, он есть в сезонной ссылке, если группа берёт ссылки кампании.</w:t>
+        <w:t>групповая рыбалка ставрида сочи</w:t>
+      </w:r>
+    </w:p>
+    <w:p/>
+    <w:p>
+      <w:r>
+        <w:rPr>
+          <w:rFonts w:ascii="Calibri" w:hAnsi="Calibri"/>
+          <w:b/>
+          <w:sz w:val="22"/>
+        </w:rPr>
+        <w:t>Кефаль</w:t>
       </w:r>
     </w:p>
     <w:p>
       <w:pPr>
-        <w:pStyle w:val="Heading1"/>
-      </w:pPr>
-      <w:r>
-        <w:t>Что сходится</w:t>
-      </w:r>
-    </w:p>
-    <w:p>
-      <w:pPr>
-        <w:pStyle w:val="ListBullet"/>
-        <w:spacing w:after="60"/>
+        <w:spacing w:after="0" w:before="0"/>
       </w:pPr>
       <w:r>
         <w:rPr>
           <w:rFonts w:ascii="Calibri" w:hAnsi="Calibri"/>
           <w:sz w:val="22"/>
         </w:rPr>
-        <w:t>2 800 ₽, 3 часа, до 8 человек, снасти, улов на борту.</w:t>
+        <w:t>рыбалка на кефаль в черном море</w:t>
       </w:r>
     </w:p>
     <w:p>
       <w:pPr>
-        <w:pStyle w:val="ListBullet"/>
-        <w:spacing w:after="60"/>
+        <w:spacing w:after="0" w:before="0"/>
       </w:pPr>
       <w:r>
         <w:rPr>
           <w:rFonts w:ascii="Calibri" w:hAnsi="Calibri"/>
           <w:sz w:val="22"/>
         </w:rPr>
-        <w:t>В текстах объявлений слоты 12:00 и 15:00.</w:t>
+        <w:t>рыбалка на кефаль в открытом море</w:t>
       </w:r>
     </w:p>
     <w:p>
       <w:pPr>
-        <w:pStyle w:val="ListBullet"/>
-        <w:spacing w:after="60"/>
+        <w:spacing w:after="0" w:before="0"/>
       </w:pPr>
       <w:r>
         <w:rPr>
           <w:rFonts w:ascii="Calibri" w:hAnsi="Calibri"/>
           <w:sz w:val="22"/>
         </w:rPr>
-        <w:t>Трофей от 20 000 ₽ и от 3 часов совпадает со страницей: морской кот и морская лисица.</w:t>
+        <w:t>рыбалка на кефаль сочи</w:t>
       </w:r>
     </w:p>
     <w:p>
       <w:pPr>
-        <w:pStyle w:val="ListBullet"/>
-        <w:spacing w:after="60"/>
+        <w:spacing w:after="0" w:before="0"/>
       </w:pPr>
       <w:r>
         <w:rPr>
           <w:rFonts w:ascii="Calibri" w:hAnsi="Calibri"/>
           <w:sz w:val="22"/>
         </w:rPr>
-        <w:t>Сезон на странице и в ссылке G5: ноябрь–декабрь, ставрида, кефаль, сарган.</w:t>
+        <w:t>рыбалка на кефаль сириус</w:t>
       </w:r>
     </w:p>
     <w:p>
       <w:pPr>
-        <w:pStyle w:val="ListBullet"/>
-        <w:spacing w:after="60"/>
+        <w:spacing w:after="0" w:before="0"/>
       </w:pPr>
       <w:r>
         <w:rPr>
           <w:rFonts w:ascii="Calibri" w:hAnsi="Calibri"/>
           <w:sz w:val="22"/>
         </w:rPr>
-        <w:t>Автотаргетинг во всех присланных группах одинаковый: широкие включены, сопутствующие, альтернативные и чужие бренды выключены.</w:t>
+        <w:t>рыбалка на кефаль адлер</w:t>
       </w:r>
     </w:p>
+    <w:p>
+      <w:pPr>
+        <w:spacing w:after="0" w:before="0"/>
+      </w:pPr>
+      <w:r>
+        <w:rPr>
+          <w:rFonts w:ascii="Calibri" w:hAnsi="Calibri"/>
+          <w:sz w:val="22"/>
+        </w:rPr>
+        <w:t>рыбалка на кефаль с катера сочи</w:t>
+      </w:r>
+    </w:p>
+    <w:p>
+      <w:pPr>
+        <w:spacing w:after="0" w:before="0"/>
+      </w:pPr>
+      <w:r>
+        <w:rPr>
+          <w:rFonts w:ascii="Calibri" w:hAnsi="Calibri"/>
+          <w:sz w:val="22"/>
+        </w:rPr>
+        <w:t>рыбалка на кефаль с катера сириус</w:t>
+      </w:r>
+    </w:p>
+    <w:p>
+      <w:pPr>
+        <w:spacing w:after="0" w:before="0"/>
+      </w:pPr>
+      <w:r>
+        <w:rPr>
+          <w:rFonts w:ascii="Calibri" w:hAnsi="Calibri"/>
+          <w:sz w:val="22"/>
+        </w:rPr>
+        <w:t>ловля кефали сочи</w:t>
+      </w:r>
+    </w:p>
+    <w:p>
+      <w:pPr>
+        <w:spacing w:after="0" w:before="0"/>
+      </w:pPr>
+      <w:r>
+        <w:rPr>
+          <w:rFonts w:ascii="Calibri" w:hAnsi="Calibri"/>
+          <w:sz w:val="22"/>
+        </w:rPr>
+        <w:t>ловля кефали сириус</w:t>
+      </w:r>
+    </w:p>
+    <w:p>
+      <w:pPr>
+        <w:spacing w:after="0" w:before="0"/>
+      </w:pPr>
+      <w:r>
+        <w:rPr>
+          <w:rFonts w:ascii="Calibri" w:hAnsi="Calibri"/>
+          <w:sz w:val="22"/>
+        </w:rPr>
+        <w:t>кефаль сочи ноябрь</w:t>
+      </w:r>
+    </w:p>
+    <w:p>
+      <w:pPr>
+        <w:spacing w:after="0" w:before="0"/>
+      </w:pPr>
+      <w:r>
+        <w:rPr>
+          <w:rFonts w:ascii="Calibri" w:hAnsi="Calibri"/>
+          <w:sz w:val="22"/>
+        </w:rPr>
+        <w:t>кефаль сочи декабрь</w:t>
+      </w:r>
+    </w:p>
+    <w:p>
+      <w:pPr>
+        <w:spacing w:after="0" w:before="0"/>
+      </w:pPr>
+      <w:r>
+        <w:rPr>
+          <w:rFonts w:ascii="Calibri" w:hAnsi="Calibri"/>
+          <w:sz w:val="22"/>
+        </w:rPr>
+        <w:t>морская рыбалка сочи кефаль</w:t>
+      </w:r>
+    </w:p>
+    <w:p>
+      <w:pPr>
+        <w:spacing w:after="0" w:before="0"/>
+      </w:pPr>
+      <w:r>
+        <w:rPr>
+          <w:rFonts w:ascii="Calibri" w:hAnsi="Calibri"/>
+          <w:sz w:val="22"/>
+        </w:rPr>
+        <w:t>морская рыбалка на кефаль</w:t>
+      </w:r>
+    </w:p>
+    <w:p>
+      <w:pPr>
+        <w:spacing w:after="0" w:before="0"/>
+      </w:pPr>
+      <w:r>
+        <w:rPr>
+          <w:rFonts w:ascii="Calibri" w:hAnsi="Calibri"/>
+          <w:sz w:val="22"/>
+        </w:rPr>
+        <w:t>сингиль сочи рыбалка</w:t>
+      </w:r>
+    </w:p>
+    <w:p>
+      <w:pPr>
+        <w:spacing w:after="0" w:before="0"/>
+      </w:pPr>
+      <w:r>
+        <w:rPr>
+          <w:rFonts w:ascii="Calibri" w:hAnsi="Calibri"/>
+          <w:sz w:val="22"/>
+        </w:rPr>
+        <w:t>ловля сингиля сочи</w:t>
+      </w:r>
+    </w:p>
+    <w:p/>
     <w:p>
       <w:r>
         <w:rPr>
           <w:rFonts w:ascii="Calibri" w:hAnsi="Calibri"/>
-          <w:b w:val="0"/>
+          <w:b/>
           <w:sz w:val="22"/>
         </w:rPr>
-        <w:t>Бюджет, цены целей и места показа в этот проход не разбирались. Пока стратегия учится, их лучше не двигать. Тексты, ключи и минус-слова на обучение ставок не завязаны.</w:t>
+        <w:t>Сарган</w:t>
       </w:r>
     </w:p>
+    <w:p>
+      <w:pPr>
+        <w:spacing w:after="0" w:before="0"/>
+      </w:pPr>
+      <w:r>
+        <w:rPr>
+          <w:rFonts w:ascii="Calibri" w:hAnsi="Calibri"/>
+          <w:sz w:val="22"/>
+        </w:rPr>
+        <w:t>рыбалка на саргана в черном море</w:t>
+      </w:r>
+    </w:p>
+    <w:p>
+      <w:pPr>
+        <w:spacing w:after="0" w:before="0"/>
+      </w:pPr>
+      <w:r>
+        <w:rPr>
+          <w:rFonts w:ascii="Calibri" w:hAnsi="Calibri"/>
+          <w:sz w:val="22"/>
+        </w:rPr>
+        <w:t>рыбалка на саргана в открытом море</w:t>
+      </w:r>
+    </w:p>
+    <w:p>
+      <w:pPr>
+        <w:spacing w:after="0" w:before="0"/>
+      </w:pPr>
+      <w:r>
+        <w:rPr>
+          <w:rFonts w:ascii="Calibri" w:hAnsi="Calibri"/>
+          <w:sz w:val="22"/>
+        </w:rPr>
+        <w:t>рыбалка на саргана сочи</w:t>
+      </w:r>
+    </w:p>
+    <w:p>
+      <w:pPr>
+        <w:spacing w:after="0" w:before="0"/>
+      </w:pPr>
+      <w:r>
+        <w:rPr>
+          <w:rFonts w:ascii="Calibri" w:hAnsi="Calibri"/>
+          <w:sz w:val="22"/>
+        </w:rPr>
+        <w:t>рыбалка на саргана сириус</w:t>
+      </w:r>
+    </w:p>
+    <w:p>
+      <w:pPr>
+        <w:spacing w:after="0" w:before="0"/>
+      </w:pPr>
+      <w:r>
+        <w:rPr>
+          <w:rFonts w:ascii="Calibri" w:hAnsi="Calibri"/>
+          <w:sz w:val="22"/>
+        </w:rPr>
+        <w:t>рыбалка на саргана адлер</w:t>
+      </w:r>
+    </w:p>
+    <w:p>
+      <w:pPr>
+        <w:spacing w:after="0" w:before="0"/>
+      </w:pPr>
+      <w:r>
+        <w:rPr>
+          <w:rFonts w:ascii="Calibri" w:hAnsi="Calibri"/>
+          <w:sz w:val="22"/>
+        </w:rPr>
+        <w:t>рыбалка на саргана с катера сочи</w:t>
+      </w:r>
+    </w:p>
+    <w:p>
+      <w:pPr>
+        <w:spacing w:after="0" w:before="0"/>
+      </w:pPr>
+      <w:r>
+        <w:rPr>
+          <w:rFonts w:ascii="Calibri" w:hAnsi="Calibri"/>
+          <w:sz w:val="22"/>
+        </w:rPr>
+        <w:t>рыбалка на саргана с катера сириус</w:t>
+      </w:r>
+    </w:p>
+    <w:p>
+      <w:pPr>
+        <w:spacing w:after="0" w:before="0"/>
+      </w:pPr>
+      <w:r>
+        <w:rPr>
+          <w:rFonts w:ascii="Calibri" w:hAnsi="Calibri"/>
+          <w:sz w:val="22"/>
+        </w:rPr>
+        <w:t>ловля саргана сочи</w:t>
+      </w:r>
+    </w:p>
+    <w:p>
+      <w:pPr>
+        <w:spacing w:after="0" w:before="0"/>
+      </w:pPr>
+      <w:r>
+        <w:rPr>
+          <w:rFonts w:ascii="Calibri" w:hAnsi="Calibri"/>
+          <w:sz w:val="22"/>
+        </w:rPr>
+        <w:t>ловля саргана сириус</w:t>
+      </w:r>
+    </w:p>
+    <w:p>
+      <w:pPr>
+        <w:spacing w:after="0" w:before="0"/>
+      </w:pPr>
+      <w:r>
+        <w:rPr>
+          <w:rFonts w:ascii="Calibri" w:hAnsi="Calibri"/>
+          <w:sz w:val="22"/>
+        </w:rPr>
+        <w:t>сарган сочи ноябрь</w:t>
+      </w:r>
+    </w:p>
+    <w:p>
+      <w:pPr>
+        <w:spacing w:after="0" w:before="0"/>
+      </w:pPr>
+      <w:r>
+        <w:rPr>
+          <w:rFonts w:ascii="Calibri" w:hAnsi="Calibri"/>
+          <w:sz w:val="22"/>
+        </w:rPr>
+        <w:t>сарган сочи декабрь</w:t>
+      </w:r>
+    </w:p>
+    <w:p>
+      <w:pPr>
+        <w:spacing w:after="0" w:before="0"/>
+      </w:pPr>
+      <w:r>
+        <w:rPr>
+          <w:rFonts w:ascii="Calibri" w:hAnsi="Calibri"/>
+          <w:sz w:val="22"/>
+        </w:rPr>
+        <w:t>морская рыбалка сочи сарган</w:t>
+      </w:r>
+    </w:p>
+    <w:p>
+      <w:pPr>
+        <w:spacing w:after="0" w:before="0"/>
+      </w:pPr>
+      <w:r>
+        <w:rPr>
+          <w:rFonts w:ascii="Calibri" w:hAnsi="Calibri"/>
+          <w:sz w:val="22"/>
+        </w:rPr>
+        <w:t>морская рыбалка на саргана</w:t>
+      </w:r>
+    </w:p>
+    <w:p/>
     <w:sectPr>
       <w:pgSz w:w="12240" w:h="15840"/>
       <w:pgMar w:top="1020" w:right="1134" w:bottom="1020" w:left="1134" w:header="720" w:footer="720" w:gutter="0"/>
@@ -1581,10 +1248,10 @@
       <w:outlineLvl w:val="1"/>
     </w:pPr>
     <w:rPr>
-      <w:rFonts w:asciiTheme="majorHAnsi" w:eastAsiaTheme="majorEastAsia" w:hAnsiTheme="majorHAnsi" w:cstheme="majorBidi" w:ascii="Calibri" w:hAnsi="Calibri"/>
+      <w:rFonts w:asciiTheme="majorHAnsi" w:eastAsiaTheme="majorEastAsia" w:hAnsiTheme="majorHAnsi" w:cstheme="majorBidi"/>
       <w:b/>
       <w:bCs/>
-      <w:color w:val="1F3A5F"/>
+      <w:color w:val="4F81BD" w:themeColor="accent1"/>
       <w:sz w:val="26"/>
       <w:szCs w:val="26"/>
     </w:rPr>

</xml_diff>

<commit_message>
Update Direct mismatches for the 8:00, 11:00 and 13:40 departures.
Co-authored-by: Igor-Lark <Igor-Lark@users.noreply.github.com>
</commit_message>
<xml_diff>
--- a/cursor/Nestykovki_Direct_RB_Popaj_2026-10-30.docx
+++ b/cursor/Nestykovki_Direct_RB_Popaj_2026-10-30.docx
@@ -15,10 +15,9 @@
       <w:r>
         <w:rPr>
           <w:rFonts w:ascii="Calibri" w:hAnsi="Calibri"/>
-          <w:b w:val="0"/>
           <w:sz w:val="22"/>
         </w:rPr>
-        <w:t>Кампания № 713632237. Страница проверена 30 октября 2026, около 23:00 мск. Выход с катамарана в открытое море. Минус-фразы кампании не разбираются: их оставляем как есть.</w:t>
+        <w:t>Кампания № 713632237. Страница проверена 31 октября 2026, около 10:15 мск. Верные выходы: 8:00, 11:00 и 13:40. На странице сейчас те же три времени. Телефоны и минус-фразы кампании в список не входят.</w:t>
       </w:r>
     </w:p>
     <w:p>
@@ -39,7 +38,7 @@
           <w:rFonts w:ascii="Calibri" w:hAnsi="Calibri"/>
           <w:sz w:val="22"/>
         </w:rPr>
-        <w:t>На странице в расписании три времени: 9:00, 12:00 и 15:00. В объявлениях и в ссылке G5 два выхода: 12:00 и 15:00.</w:t>
+        <w:t>В тексте G1–G3 остаётся фраза «выходы в 12:00 и 15:00». Ссылка кампании уже говорит 8:00, 11:00 и 13:40. Директ может показать старые часы рядом с новой ссылкой.</w:t>
       </w:r>
     </w:p>
     <w:p>
@@ -52,7 +51,7 @@
           <w:rFonts w:ascii="Calibri" w:hAnsi="Calibri"/>
           <w:sz w:val="22"/>
         </w:rPr>
-        <w:t>На карточке ставриды лучший клёв указан рано утром или вечером. Катамаран уходит в 12:00 и 15:00.</w:t>
+        <w:t>В тексте G10 остаётся «Выход в море 12:00 и 15:00». Ссылки G10 берутся из кампании, там уже 8:00, 11:00 и 13:40.</w:t>
       </w:r>
     </w:p>
     <w:p>
@@ -65,7 +64,7 @@
           <w:rFonts w:ascii="Calibri" w:hAnsi="Calibri"/>
           <w:sz w:val="22"/>
         </w:rPr>
-        <w:t>Карточка кефали описывает лов у бун и в устьях рек. Продукт — катамаран, который уходит в открытое море. В сезонном абзаце кефаль только «подходит ближе к берегу», без бун.</w:t>
+        <w:t>У G5 свои ссылки. Вчера в расписании G5 было два выхода, 12:00 и 15:00. В сегодняшнем сообщении эти ссылки не обновлены. Если их не меняли, G5 зовёт на старое время, страница и кампания уже на новом.</w:t>
       </w:r>
     </w:p>
     <w:p>
@@ -78,7 +77,7 @@
           <w:rFonts w:ascii="Calibri" w:hAnsi="Calibri"/>
           <w:sz w:val="22"/>
         </w:rPr>
-        <w:t>На странице причал записан так: улица Голубая, 1, Имеретинский порт, линия 2. Ссылка G5 повторяет Голубую. Ссылка G9 пишет «Парусная, 1». Если ссылки кампании для G1–G3 и G10 не менялись, там тоже Парусная, и этой улицы на странице нет.</w:t>
+        <w:t>Ссылка G9 «Причал» пишет Парусная, 1. На странице и в ссылке кампании причал — Голубая, 1, Имеретинский порт, линия 2.</w:t>
       </w:r>
     </w:p>
     <w:p>
@@ -91,7 +90,7 @@
           <w:rFonts w:ascii="Calibri" w:hAnsi="Calibri"/>
           <w:sz w:val="22"/>
         </w:rPr>
-        <w:t>Заголовок G5 обрывается запятой: «3 часа рыбалки в море с катамарана - выходы каждый день,».</w:t>
+        <w:t>На карточке ставриды лучший клёв указан рано утром или вечером. Выход в 8:00 на утро похож. Вечернего выхода нет: последний в 13:40.</w:t>
       </w:r>
     </w:p>
     <w:p>
@@ -104,7 +103,7 @@
           <w:rFonts w:ascii="Calibri" w:hAnsi="Calibri"/>
           <w:sz w:val="22"/>
         </w:rPr>
-        <w:t>В одном тексте G5 названы только ставрида и кефаль. Сарган есть в заголовке «Групповая рыбалка в ноябре» и в сезонной ссылке. Пока Директ не подставит этот заголовок, объявление саргана не называет.</w:t>
+        <w:t>Карточка кефали описывает лов у бун и в устьях. Выход — катамаран в открытое море. В сезонном абзаце кефаль только подходит ближе к берегу.</w:t>
       </w:r>
     </w:p>
     <w:p>
@@ -117,7 +116,7 @@
           <w:rFonts w:ascii="Calibri" w:hAnsi="Calibri"/>
           <w:sz w:val="22"/>
         </w:rPr>
-        <w:t>Текст «Не бронируйте весь катер…» стоит в G5 и предлагался для групповых объявлений. Он начинается с отказа. Замена — в конце файла.</w:t>
+        <w:t>В одном тексте G5 названы только ставрида и кефаль. Сарган есть в заголовке и в сезонной ссылке.</w:t>
       </w:r>
     </w:p>
     <w:p>
@@ -130,7 +129,7 @@
           <w:rFonts w:ascii="Calibri" w:hAnsi="Calibri"/>
           <w:sz w:val="22"/>
         </w:rPr>
-        <w:t>На сезонной группе G5 висит ссылка «Трофейная рыбалка» от 20 000 ₽. Минуса группы пускают туда только с объявления билета 2 800 ₽.</w:t>
+        <w:t>Ключ G10 «рыбалка с яхты сочи» показывает групповой катамаран за 2 800 ₽. В G1–G3, G5 и G9 этот запрос закрыт минусом «-яхты». Лодка — катамаран.</w:t>
       </w:r>
     </w:p>
     <w:p>
@@ -143,7 +142,7 @@
           <w:rFonts w:ascii="Calibri" w:hAnsi="Calibri"/>
           <w:sz w:val="22"/>
         </w:rPr>
-        <w:t>В G9 ссылка «Групповой билет на рыбалку» за 2 800 ₽ стоит на трофейном объявлении и уводит на другой формат.</w:t>
+        <w:t>Ключ G10 «рыбалка хоста море» ищет рыбалку в Хосте. Выход из Имеретинского порта.</w:t>
       </w:r>
     </w:p>
     <w:p>
@@ -156,7 +155,7 @@
           <w:rFonts w:ascii="Calibri" w:hAnsi="Calibri"/>
           <w:sz w:val="22"/>
         </w:rPr>
-        <w:t>Ключ G10 «рыбалка с яхты сочи» показывает групповой катамаран за 2 800 ₽. В G1–G3, G5 и G9 запрос закрыт минусом «-яхты». Лодка — катамаран, не яхта.</w:t>
+        <w:t>Ключ G10 «"рыбалка в черном море"» ловит запрос без города по всему берегу.</w:t>
       </w:r>
     </w:p>
     <w:p>
@@ -169,7 +168,7 @@
           <w:rFonts w:ascii="Calibri" w:hAnsi="Calibri"/>
           <w:sz w:val="22"/>
         </w:rPr>
-        <w:t>Ключ G10 «рыбалка хоста море» ищет рыбалку в Хосте. Выход из Имеретинского порта в открытое море.</w:t>
+        <w:t>В G1–G3 по-прежнему нет ключей на ставриду, кефаль и сарган. G5 с этими ключами только на Краснодарский край.</w:t>
       </w:r>
     </w:p>
     <w:p>
@@ -182,608 +181,9 @@
           <w:rFonts w:ascii="Calibri" w:hAnsi="Calibri"/>
           <w:sz w:val="22"/>
         </w:rPr>
-        <w:t>Ключ G10 «"рыбалка в черном море"» ловит запрос без города, по всему берегу. Крым, Геленджик, Анапа и Туапсе минусами закрыты, сам запрос без города нет.</w:t>
+        <w:t>Интересы G10, если это условие показа, а не наценка, отсекут человека без метки рыбака. В списке есть boatfishing-sochi.ru и rental-yacht.ru.</w:t>
       </w:r>
     </w:p>
-    <w:p>
-      <w:pPr>
-        <w:pStyle w:val="ListBullet"/>
-        <w:spacing w:after="60"/>
-      </w:pPr>
-      <w:r>
-        <w:rPr>
-          <w:rFonts w:ascii="Calibri" w:hAnsi="Calibri"/>
-          <w:sz w:val="22"/>
-        </w:rPr>
-        <w:t>В G1–G3 нет ключей на ставриду, кефаль и сарган. G5 с этими ключами ограничена Краснодарским краем, запрос из Москвы в неё не попадает. Фразы для вставки — в конце файла. Внутри края те же фразы уже есть в G5, группы будут делить эти показы.</w:t>
-      </w:r>
-    </w:p>
-    <w:p>
-      <w:pPr>
-        <w:pStyle w:val="ListBullet"/>
-        <w:spacing w:after="60"/>
-      </w:pPr>
-      <w:r>
-        <w:rPr>
-          <w:rFonts w:ascii="Calibri" w:hAnsi="Calibri"/>
-          <w:sz w:val="22"/>
-        </w:rPr>
-        <w:t>Интересы G10, если это условие показа, а не наценка, отсекут человека без метки рыбака. В списке есть чужие сайты boatfishing-sochi.ru и rental-yacht.ru.</w:t>
-      </w:r>
-    </w:p>
-    <w:p>
-      <w:pPr>
-        <w:pStyle w:val="Heading1"/>
-      </w:pPr>
-      <w:r>
-        <w:t>Текст вместо «Не бронируйте весь катер…»</w:t>
-      </w:r>
-    </w:p>
-    <w:p>
-      <w:r>
-        <w:rPr>
-          <w:rFonts w:ascii="Calibri" w:hAnsi="Calibri"/>
-          <w:b w:val="0"/>
-          <w:sz w:val="22"/>
-        </w:rPr>
-        <w:t>Займите место в группе: катамаран "Моряк Попай", 2800 ₽, до 8 человек.</w:t>
-      </w:r>
-    </w:p>
-    <w:p>
-      <w:pPr>
-        <w:pStyle w:val="Heading1"/>
-      </w:pPr>
-      <w:r>
-        <w:t>Ключи ставриды, кефали и саргана для G1–G3</w:t>
-      </w:r>
-    </w:p>
-    <w:p>
-      <w:r>
-        <w:rPr>
-          <w:rFonts w:ascii="Calibri" w:hAnsi="Calibri"/>
-          <w:b w:val="0"/>
-          <w:sz w:val="22"/>
-        </w:rPr>
-        <w:t>География группы уже Россия, отдельные города в ключах не режутся минусами кампании. Коротких фраз без слова «рыбалка» здесь нет: они тянут магазин и кухню.</w:t>
-      </w:r>
-    </w:p>
-    <w:p>
-      <w:r>
-        <w:rPr>
-          <w:rFonts w:ascii="Calibri" w:hAnsi="Calibri"/>
-          <w:b/>
-          <w:sz w:val="22"/>
-        </w:rPr>
-        <w:t>Ставрида</w:t>
-      </w:r>
-    </w:p>
-    <w:p>
-      <w:pPr>
-        <w:spacing w:after="0" w:before="0"/>
-      </w:pPr>
-      <w:r>
-        <w:rPr>
-          <w:rFonts w:ascii="Calibri" w:hAnsi="Calibri"/>
-          <w:sz w:val="22"/>
-        </w:rPr>
-        <w:t>рыбалка на ставриду в черном море</w:t>
-      </w:r>
-    </w:p>
-    <w:p>
-      <w:pPr>
-        <w:spacing w:after="0" w:before="0"/>
-      </w:pPr>
-      <w:r>
-        <w:rPr>
-          <w:rFonts w:ascii="Calibri" w:hAnsi="Calibri"/>
-          <w:sz w:val="22"/>
-        </w:rPr>
-        <w:t>рыбалка на ставриду в открытом море</w:t>
-      </w:r>
-    </w:p>
-    <w:p>
-      <w:pPr>
-        <w:spacing w:after="0" w:before="0"/>
-      </w:pPr>
-      <w:r>
-        <w:rPr>
-          <w:rFonts w:ascii="Calibri" w:hAnsi="Calibri"/>
-          <w:sz w:val="22"/>
-        </w:rPr>
-        <w:t>рыбалка на ставриду сочи</w:t>
-      </w:r>
-    </w:p>
-    <w:p>
-      <w:pPr>
-        <w:spacing w:after="0" w:before="0"/>
-      </w:pPr>
-      <w:r>
-        <w:rPr>
-          <w:rFonts w:ascii="Calibri" w:hAnsi="Calibri"/>
-          <w:sz w:val="22"/>
-        </w:rPr>
-        <w:t>рыбалка на ставриду сириус</w:t>
-      </w:r>
-    </w:p>
-    <w:p>
-      <w:pPr>
-        <w:spacing w:after="0" w:before="0"/>
-      </w:pPr>
-      <w:r>
-        <w:rPr>
-          <w:rFonts w:ascii="Calibri" w:hAnsi="Calibri"/>
-          <w:sz w:val="22"/>
-        </w:rPr>
-        <w:t>рыбалка на ставриду адлер</w:t>
-      </w:r>
-    </w:p>
-    <w:p>
-      <w:pPr>
-        <w:spacing w:after="0" w:before="0"/>
-      </w:pPr>
-      <w:r>
-        <w:rPr>
-          <w:rFonts w:ascii="Calibri" w:hAnsi="Calibri"/>
-          <w:sz w:val="22"/>
-        </w:rPr>
-        <w:t>рыбалка на ставриду с катера сочи</w:t>
-      </w:r>
-    </w:p>
-    <w:p>
-      <w:pPr>
-        <w:spacing w:after="0" w:before="0"/>
-      </w:pPr>
-      <w:r>
-        <w:rPr>
-          <w:rFonts w:ascii="Calibri" w:hAnsi="Calibri"/>
-          <w:sz w:val="22"/>
-        </w:rPr>
-        <w:t>рыбалка на ставриду с катера сириус</w:t>
-      </w:r>
-    </w:p>
-    <w:p>
-      <w:pPr>
-        <w:spacing w:after="0" w:before="0"/>
-      </w:pPr>
-      <w:r>
-        <w:rPr>
-          <w:rFonts w:ascii="Calibri" w:hAnsi="Calibri"/>
-          <w:sz w:val="22"/>
-        </w:rPr>
-        <w:t>ловля ставриды сочи</w:t>
-      </w:r>
-    </w:p>
-    <w:p>
-      <w:pPr>
-        <w:spacing w:after="0" w:before="0"/>
-      </w:pPr>
-      <w:r>
-        <w:rPr>
-          <w:rFonts w:ascii="Calibri" w:hAnsi="Calibri"/>
-          <w:sz w:val="22"/>
-        </w:rPr>
-        <w:t>ловля ставриды сириус</w:t>
-      </w:r>
-    </w:p>
-    <w:p>
-      <w:pPr>
-        <w:spacing w:after="0" w:before="0"/>
-      </w:pPr>
-      <w:r>
-        <w:rPr>
-          <w:rFonts w:ascii="Calibri" w:hAnsi="Calibri"/>
-          <w:sz w:val="22"/>
-        </w:rPr>
-        <w:t>ставрида сочи ноябрь</w:t>
-      </w:r>
-    </w:p>
-    <w:p>
-      <w:pPr>
-        <w:spacing w:after="0" w:before="0"/>
-      </w:pPr>
-      <w:r>
-        <w:rPr>
-          <w:rFonts w:ascii="Calibri" w:hAnsi="Calibri"/>
-          <w:sz w:val="22"/>
-        </w:rPr>
-        <w:t>ставрида сочи декабрь</w:t>
-      </w:r>
-    </w:p>
-    <w:p>
-      <w:pPr>
-        <w:spacing w:after="0" w:before="0"/>
-      </w:pPr>
-      <w:r>
-        <w:rPr>
-          <w:rFonts w:ascii="Calibri" w:hAnsi="Calibri"/>
-          <w:sz w:val="22"/>
-        </w:rPr>
-        <w:t>морская рыбалка сочи ставрида</w:t>
-      </w:r>
-    </w:p>
-    <w:p>
-      <w:pPr>
-        <w:spacing w:after="0" w:before="0"/>
-      </w:pPr>
-      <w:r>
-        <w:rPr>
-          <w:rFonts w:ascii="Calibri" w:hAnsi="Calibri"/>
-          <w:sz w:val="22"/>
-        </w:rPr>
-        <w:t>морская рыбалка на ставриду</w:t>
-      </w:r>
-    </w:p>
-    <w:p>
-      <w:pPr>
-        <w:spacing w:after="0" w:before="0"/>
-      </w:pPr>
-      <w:r>
-        <w:rPr>
-          <w:rFonts w:ascii="Calibri" w:hAnsi="Calibri"/>
-          <w:sz w:val="22"/>
-        </w:rPr>
-        <w:t>групповая рыбалка ставрида сочи</w:t>
-      </w:r>
-    </w:p>
-    <w:p/>
-    <w:p>
-      <w:r>
-        <w:rPr>
-          <w:rFonts w:ascii="Calibri" w:hAnsi="Calibri"/>
-          <w:b/>
-          <w:sz w:val="22"/>
-        </w:rPr>
-        <w:t>Кефаль</w:t>
-      </w:r>
-    </w:p>
-    <w:p>
-      <w:pPr>
-        <w:spacing w:after="0" w:before="0"/>
-      </w:pPr>
-      <w:r>
-        <w:rPr>
-          <w:rFonts w:ascii="Calibri" w:hAnsi="Calibri"/>
-          <w:sz w:val="22"/>
-        </w:rPr>
-        <w:t>рыбалка на кефаль в черном море</w:t>
-      </w:r>
-    </w:p>
-    <w:p>
-      <w:pPr>
-        <w:spacing w:after="0" w:before="0"/>
-      </w:pPr>
-      <w:r>
-        <w:rPr>
-          <w:rFonts w:ascii="Calibri" w:hAnsi="Calibri"/>
-          <w:sz w:val="22"/>
-        </w:rPr>
-        <w:t>рыбалка на кефаль в открытом море</w:t>
-      </w:r>
-    </w:p>
-    <w:p>
-      <w:pPr>
-        <w:spacing w:after="0" w:before="0"/>
-      </w:pPr>
-      <w:r>
-        <w:rPr>
-          <w:rFonts w:ascii="Calibri" w:hAnsi="Calibri"/>
-          <w:sz w:val="22"/>
-        </w:rPr>
-        <w:t>рыбалка на кефаль сочи</w:t>
-      </w:r>
-    </w:p>
-    <w:p>
-      <w:pPr>
-        <w:spacing w:after="0" w:before="0"/>
-      </w:pPr>
-      <w:r>
-        <w:rPr>
-          <w:rFonts w:ascii="Calibri" w:hAnsi="Calibri"/>
-          <w:sz w:val="22"/>
-        </w:rPr>
-        <w:t>рыбалка на кефаль сириус</w:t>
-      </w:r>
-    </w:p>
-    <w:p>
-      <w:pPr>
-        <w:spacing w:after="0" w:before="0"/>
-      </w:pPr>
-      <w:r>
-        <w:rPr>
-          <w:rFonts w:ascii="Calibri" w:hAnsi="Calibri"/>
-          <w:sz w:val="22"/>
-        </w:rPr>
-        <w:t>рыбалка на кефаль адлер</w:t>
-      </w:r>
-    </w:p>
-    <w:p>
-      <w:pPr>
-        <w:spacing w:after="0" w:before="0"/>
-      </w:pPr>
-      <w:r>
-        <w:rPr>
-          <w:rFonts w:ascii="Calibri" w:hAnsi="Calibri"/>
-          <w:sz w:val="22"/>
-        </w:rPr>
-        <w:t>рыбалка на кефаль с катера сочи</w:t>
-      </w:r>
-    </w:p>
-    <w:p>
-      <w:pPr>
-        <w:spacing w:after="0" w:before="0"/>
-      </w:pPr>
-      <w:r>
-        <w:rPr>
-          <w:rFonts w:ascii="Calibri" w:hAnsi="Calibri"/>
-          <w:sz w:val="22"/>
-        </w:rPr>
-        <w:t>рыбалка на кефаль с катера сириус</w:t>
-      </w:r>
-    </w:p>
-    <w:p>
-      <w:pPr>
-        <w:spacing w:after="0" w:before="0"/>
-      </w:pPr>
-      <w:r>
-        <w:rPr>
-          <w:rFonts w:ascii="Calibri" w:hAnsi="Calibri"/>
-          <w:sz w:val="22"/>
-        </w:rPr>
-        <w:t>ловля кефали сочи</w:t>
-      </w:r>
-    </w:p>
-    <w:p>
-      <w:pPr>
-        <w:spacing w:after="0" w:before="0"/>
-      </w:pPr>
-      <w:r>
-        <w:rPr>
-          <w:rFonts w:ascii="Calibri" w:hAnsi="Calibri"/>
-          <w:sz w:val="22"/>
-        </w:rPr>
-        <w:t>ловля кефали сириус</w:t>
-      </w:r>
-    </w:p>
-    <w:p>
-      <w:pPr>
-        <w:spacing w:after="0" w:before="0"/>
-      </w:pPr>
-      <w:r>
-        <w:rPr>
-          <w:rFonts w:ascii="Calibri" w:hAnsi="Calibri"/>
-          <w:sz w:val="22"/>
-        </w:rPr>
-        <w:t>кефаль сочи ноябрь</w:t>
-      </w:r>
-    </w:p>
-    <w:p>
-      <w:pPr>
-        <w:spacing w:after="0" w:before="0"/>
-      </w:pPr>
-      <w:r>
-        <w:rPr>
-          <w:rFonts w:ascii="Calibri" w:hAnsi="Calibri"/>
-          <w:sz w:val="22"/>
-        </w:rPr>
-        <w:t>кефаль сочи декабрь</w:t>
-      </w:r>
-    </w:p>
-    <w:p>
-      <w:pPr>
-        <w:spacing w:after="0" w:before="0"/>
-      </w:pPr>
-      <w:r>
-        <w:rPr>
-          <w:rFonts w:ascii="Calibri" w:hAnsi="Calibri"/>
-          <w:sz w:val="22"/>
-        </w:rPr>
-        <w:t>морская рыбалка сочи кефаль</w:t>
-      </w:r>
-    </w:p>
-    <w:p>
-      <w:pPr>
-        <w:spacing w:after="0" w:before="0"/>
-      </w:pPr>
-      <w:r>
-        <w:rPr>
-          <w:rFonts w:ascii="Calibri" w:hAnsi="Calibri"/>
-          <w:sz w:val="22"/>
-        </w:rPr>
-        <w:t>морская рыбалка на кефаль</w:t>
-      </w:r>
-    </w:p>
-    <w:p>
-      <w:pPr>
-        <w:spacing w:after="0" w:before="0"/>
-      </w:pPr>
-      <w:r>
-        <w:rPr>
-          <w:rFonts w:ascii="Calibri" w:hAnsi="Calibri"/>
-          <w:sz w:val="22"/>
-        </w:rPr>
-        <w:t>сингиль сочи рыбалка</w:t>
-      </w:r>
-    </w:p>
-    <w:p>
-      <w:pPr>
-        <w:spacing w:after="0" w:before="0"/>
-      </w:pPr>
-      <w:r>
-        <w:rPr>
-          <w:rFonts w:ascii="Calibri" w:hAnsi="Calibri"/>
-          <w:sz w:val="22"/>
-        </w:rPr>
-        <w:t>ловля сингиля сочи</w:t>
-      </w:r>
-    </w:p>
-    <w:p/>
-    <w:p>
-      <w:r>
-        <w:rPr>
-          <w:rFonts w:ascii="Calibri" w:hAnsi="Calibri"/>
-          <w:b/>
-          <w:sz w:val="22"/>
-        </w:rPr>
-        <w:t>Сарган</w:t>
-      </w:r>
-    </w:p>
-    <w:p>
-      <w:pPr>
-        <w:spacing w:after="0" w:before="0"/>
-      </w:pPr>
-      <w:r>
-        <w:rPr>
-          <w:rFonts w:ascii="Calibri" w:hAnsi="Calibri"/>
-          <w:sz w:val="22"/>
-        </w:rPr>
-        <w:t>рыбалка на саргана в черном море</w:t>
-      </w:r>
-    </w:p>
-    <w:p>
-      <w:pPr>
-        <w:spacing w:after="0" w:before="0"/>
-      </w:pPr>
-      <w:r>
-        <w:rPr>
-          <w:rFonts w:ascii="Calibri" w:hAnsi="Calibri"/>
-          <w:sz w:val="22"/>
-        </w:rPr>
-        <w:t>рыбалка на саргана в открытом море</w:t>
-      </w:r>
-    </w:p>
-    <w:p>
-      <w:pPr>
-        <w:spacing w:after="0" w:before="0"/>
-      </w:pPr>
-      <w:r>
-        <w:rPr>
-          <w:rFonts w:ascii="Calibri" w:hAnsi="Calibri"/>
-          <w:sz w:val="22"/>
-        </w:rPr>
-        <w:t>рыбалка на саргана сочи</w:t>
-      </w:r>
-    </w:p>
-    <w:p>
-      <w:pPr>
-        <w:spacing w:after="0" w:before="0"/>
-      </w:pPr>
-      <w:r>
-        <w:rPr>
-          <w:rFonts w:ascii="Calibri" w:hAnsi="Calibri"/>
-          <w:sz w:val="22"/>
-        </w:rPr>
-        <w:t>рыбалка на саргана сириус</w:t>
-      </w:r>
-    </w:p>
-    <w:p>
-      <w:pPr>
-        <w:spacing w:after="0" w:before="0"/>
-      </w:pPr>
-      <w:r>
-        <w:rPr>
-          <w:rFonts w:ascii="Calibri" w:hAnsi="Calibri"/>
-          <w:sz w:val="22"/>
-        </w:rPr>
-        <w:t>рыбалка на саргана адлер</w:t>
-      </w:r>
-    </w:p>
-    <w:p>
-      <w:pPr>
-        <w:spacing w:after="0" w:before="0"/>
-      </w:pPr>
-      <w:r>
-        <w:rPr>
-          <w:rFonts w:ascii="Calibri" w:hAnsi="Calibri"/>
-          <w:sz w:val="22"/>
-        </w:rPr>
-        <w:t>рыбалка на саргана с катера сочи</w:t>
-      </w:r>
-    </w:p>
-    <w:p>
-      <w:pPr>
-        <w:spacing w:after="0" w:before="0"/>
-      </w:pPr>
-      <w:r>
-        <w:rPr>
-          <w:rFonts w:ascii="Calibri" w:hAnsi="Calibri"/>
-          <w:sz w:val="22"/>
-        </w:rPr>
-        <w:t>рыбалка на саргана с катера сириус</w:t>
-      </w:r>
-    </w:p>
-    <w:p>
-      <w:pPr>
-        <w:spacing w:after="0" w:before="0"/>
-      </w:pPr>
-      <w:r>
-        <w:rPr>
-          <w:rFonts w:ascii="Calibri" w:hAnsi="Calibri"/>
-          <w:sz w:val="22"/>
-        </w:rPr>
-        <w:t>ловля саргана сочи</w:t>
-      </w:r>
-    </w:p>
-    <w:p>
-      <w:pPr>
-        <w:spacing w:after="0" w:before="0"/>
-      </w:pPr>
-      <w:r>
-        <w:rPr>
-          <w:rFonts w:ascii="Calibri" w:hAnsi="Calibri"/>
-          <w:sz w:val="22"/>
-        </w:rPr>
-        <w:t>ловля саргана сириус</w:t>
-      </w:r>
-    </w:p>
-    <w:p>
-      <w:pPr>
-        <w:spacing w:after="0" w:before="0"/>
-      </w:pPr>
-      <w:r>
-        <w:rPr>
-          <w:rFonts w:ascii="Calibri" w:hAnsi="Calibri"/>
-          <w:sz w:val="22"/>
-        </w:rPr>
-        <w:t>сарган сочи ноябрь</w:t>
-      </w:r>
-    </w:p>
-    <w:p>
-      <w:pPr>
-        <w:spacing w:after="0" w:before="0"/>
-      </w:pPr>
-      <w:r>
-        <w:rPr>
-          <w:rFonts w:ascii="Calibri" w:hAnsi="Calibri"/>
-          <w:sz w:val="22"/>
-        </w:rPr>
-        <w:t>сарган сочи декабрь</w:t>
-      </w:r>
-    </w:p>
-    <w:p>
-      <w:pPr>
-        <w:spacing w:after="0" w:before="0"/>
-      </w:pPr>
-      <w:r>
-        <w:rPr>
-          <w:rFonts w:ascii="Calibri" w:hAnsi="Calibri"/>
-          <w:sz w:val="22"/>
-        </w:rPr>
-        <w:t>морская рыбалка сочи сарган</w:t>
-      </w:r>
-    </w:p>
-    <w:p>
-      <w:pPr>
-        <w:spacing w:after="0" w:before="0"/>
-      </w:pPr>
-      <w:r>
-        <w:rPr>
-          <w:rFonts w:ascii="Calibri" w:hAnsi="Calibri"/>
-          <w:sz w:val="22"/>
-        </w:rPr>
-        <w:t>морская рыбалка на саргана</w:t>
-      </w:r>
-    </w:p>
-    <w:p/>
     <w:sectPr>
       <w:pgSz w:w="12240" w:h="15840"/>
       <w:pgMar w:top="1020" w:right="1134" w:bottom="1020" w:left="1134" w:header="720" w:footer="720" w:gutter="0"/>

</xml_diff>

<commit_message>
Record the 31 October mismatches and the day's search waste.
Co-authored-by: Igor-Lark <Igor-Lark@users.noreply.github.com>
</commit_message>
<xml_diff>
--- a/cursor/Nestykovki_Direct_RB_Popaj_2026-10-30.docx
+++ b/cursor/Nestykovki_Direct_RB_Popaj_2026-10-30.docx
@@ -8,7 +8,7 @@
         <w:jc w:val="left"/>
       </w:pPr>
       <w:r>
-        <w:t>Нестыковки Директа: групповая рыбалка «Моряк Попай»</w:t>
+        <w:t>Нестыковки Директа, 31 октября 2026</w:t>
       </w:r>
     </w:p>
     <w:p>
@@ -17,7 +17,7 @@
           <w:rFonts w:ascii="Calibri" w:hAnsi="Calibri"/>
           <w:sz w:val="22"/>
         </w:rPr>
-        <w:t>Кампания № 713632237. Страница проверена 31 октября 2026, около 10:15 мск. Верные выходы: 8:00, 11:00 и 13:40. На странице сейчас те же три времени. Телефоны и минус-фразы кампании в список не входят.</w:t>
+        <w:t>Кампания № 713632237. Выходы 8:00, 11:00 и 13:40 стоят на странице, в текстах G1–G3 и G10 и в ссылках кампании. G5 берёт ссылки кампании. Телефоны и старый список минусов кампании не разбираются.</w:t>
       </w:r>
     </w:p>
     <w:p>
@@ -30,60 +30,73 @@
     </w:p>
     <w:p>
       <w:pPr>
-        <w:pStyle w:val="ListBullet"/>
-        <w:spacing w:after="60"/>
+        <w:pStyle w:val="ListNumber"/>
+        <w:spacing w:after="80"/>
       </w:pPr>
       <w:r>
         <w:rPr>
           <w:rFonts w:ascii="Calibri" w:hAnsi="Calibri"/>
           <w:sz w:val="22"/>
         </w:rPr>
-        <w:t>В тексте G1–G3 остаётся фраза «выходы в 12:00 и 15:00». Ссылка кампании уже говорит 8:00, 11:00 и 13:40. Директ может показать старые часы рядом с новой ссылкой.</w:t>
+        <w:t>Ключ G10 «рыбалка с яхты сочи» показывает групповой катамаран за 2 800 ₽. В G1–G3, G5 и G9 запрос закрыт минусом «-яхты». Лодка — катамаран.</w:t>
       </w:r>
     </w:p>
     <w:p>
       <w:pPr>
-        <w:pStyle w:val="ListBullet"/>
-        <w:spacing w:after="60"/>
+        <w:pStyle w:val="ListNumber"/>
+        <w:spacing w:after="80"/>
       </w:pPr>
       <w:r>
         <w:rPr>
           <w:rFonts w:ascii="Calibri" w:hAnsi="Calibri"/>
           <w:sz w:val="22"/>
         </w:rPr>
-        <w:t>В тексте G10 остаётся «Выход в море 12:00 и 15:00». Ссылки G10 берутся из кампании, там уже 8:00, 11:00 и 13:40.</w:t>
+        <w:t>Ключ G10 «рыбалка хоста море» ищет рыбалку в Хосте. Выход из Имеретинского порта в открытое море.</w:t>
       </w:r>
     </w:p>
     <w:p>
       <w:pPr>
-        <w:pStyle w:val="ListBullet"/>
-        <w:spacing w:after="60"/>
+        <w:pStyle w:val="ListNumber"/>
+        <w:spacing w:after="80"/>
       </w:pPr>
       <w:r>
         <w:rPr>
           <w:rFonts w:ascii="Calibri" w:hAnsi="Calibri"/>
           <w:sz w:val="22"/>
         </w:rPr>
-        <w:t>У G5 свои ссылки. Вчера в расписании G5 было два выхода, 12:00 и 15:00. В сегодняшнем сообщении эти ссылки не обновлены. Если их не меняли, G5 зовёт на старое время, страница и кампания уже на новом.</w:t>
+        <w:t>Ключ G10 «рыбалка в черном море» в кавычках ловит запрос без города, по всему берегу.</w:t>
       </w:r>
     </w:p>
     <w:p>
       <w:pPr>
-        <w:pStyle w:val="ListBullet"/>
-        <w:spacing w:after="60"/>
+        <w:pStyle w:val="ListNumber"/>
+        <w:spacing w:after="80"/>
       </w:pPr>
       <w:r>
         <w:rPr>
           <w:rFonts w:ascii="Calibri" w:hAnsi="Calibri"/>
           <w:sz w:val="22"/>
         </w:rPr>
-        <w:t>Ссылка G9 «Причал» пишет Парусная, 1. На странице и в ссылке кампании причал — Голубая, 1, Имеретинский порт, линия 2.</w:t>
+        <w:t>Ссылка G9 «Причал», если её не меняли, пишет Парусная, 1. На странице и в ссылке кампании причал — Голубая, 1, линия 2.</w:t>
       </w:r>
     </w:p>
     <w:p>
       <w:pPr>
-        <w:pStyle w:val="ListBullet"/>
-        <w:spacing w:after="60"/>
+        <w:pStyle w:val="ListNumber"/>
+        <w:spacing w:after="80"/>
+      </w:pPr>
+      <w:r>
+        <w:rPr>
+          <w:rFonts w:ascii="Calibri" w:hAnsi="Calibri"/>
+          <w:sz w:val="22"/>
+        </w:rPr>
+        <w:t>На ключах ставриды, кефали и саргана минус «-катер» отсекает «на катере». Отдельные ключи есть только в форме «с катера». Запрос «рыбалка на ставриду на катере сочи» группа не берёт.</w:t>
+      </w:r>
+    </w:p>
+    <w:p>
+      <w:pPr>
+        <w:pStyle w:val="ListNumber"/>
+        <w:spacing w:after="80"/>
       </w:pPr>
       <w:r>
         <w:rPr>
@@ -95,93 +108,72 @@
     </w:p>
     <w:p>
       <w:pPr>
-        <w:pStyle w:val="ListBullet"/>
-        <w:spacing w:after="60"/>
+        <w:pStyle w:val="ListNumber"/>
+        <w:spacing w:after="80"/>
       </w:pPr>
       <w:r>
         <w:rPr>
           <w:rFonts w:ascii="Calibri" w:hAnsi="Calibri"/>
           <w:sz w:val="22"/>
         </w:rPr>
-        <w:t>Карточка кефали описывает лов у бун и в устьях. Выход — катамаран в открытое море. В сезонном абзаце кефаль только подходит ближе к берегу.</w:t>
+        <w:t>Карточка кефали описывает лов у бун и в устьях. Выход — катамаран в открытое море.</w:t>
       </w:r>
     </w:p>
     <w:p>
       <w:pPr>
-        <w:pStyle w:val="ListBullet"/>
-        <w:spacing w:after="60"/>
+        <w:pStyle w:val="ListNumber"/>
+        <w:spacing w:after="80"/>
       </w:pPr>
       <w:r>
         <w:rPr>
           <w:rFonts w:ascii="Calibri" w:hAnsi="Calibri"/>
           <w:sz w:val="22"/>
         </w:rPr>
-        <w:t>В одном тексте G5 названы только ставрида и кефаль. Сарган есть в заголовке и в сезонной ссылке.</w:t>
+        <w:t>В тексте G5 по-прежнему названы только ставрида и кефаль. Сарган есть в заголовке и в сезонной ссылке.</w:t>
       </w:r>
     </w:p>
     <w:p>
       <w:pPr>
-        <w:pStyle w:val="ListBullet"/>
-        <w:spacing w:after="60"/>
+        <w:pStyle w:val="Heading1"/>
       </w:pPr>
+      <w:r>
+        <w:t>Статистика 31 октября</w:t>
+      </w:r>
+    </w:p>
+    <w:p>
       <w:r>
         <w:rPr>
           <w:rFonts w:ascii="Calibri" w:hAnsi="Calibri"/>
           <w:sz w:val="22"/>
         </w:rPr>
-        <w:t>Ключ G10 «рыбалка с яхты сочи» показывает групповой катамаран за 2 800 ₽. В G1–G3, G5 и G9 этот запрос закрыт минусом «-яхты». Лодка — катамаран.</w:t>
+        <w:t>196 показов, 4 клика, 0 конверсий, расход 0 ₽: оплата за конверсии. Поиск 53 показа и 1 клик, сети 143 показа и 3 клика.</w:t>
       </w:r>
     </w:p>
     <w:p>
-      <w:pPr>
-        <w:pStyle w:val="ListBullet"/>
-        <w:spacing w:after="60"/>
-      </w:pPr>
       <w:r>
         <w:rPr>
           <w:rFonts w:ascii="Calibri" w:hAnsi="Calibri"/>
           <w:sz w:val="22"/>
         </w:rPr>
-        <w:t>Ключ G10 «рыбалка хоста море» ищет рыбалку в Хосте. Выход из Имеретинского порта.</w:t>
+        <w:t>Широкие запросы оставляем включёнными. За день они дали 25 показов и 1 клик, и этот клик — «платная рыбалка сочи». Вместе с ними пришли аренда, КМВ, Ахтуба, судак и форель. Это закрывается минусами, а не выключением широких. Строки «сопутствующие» в отчёте — семантические показы по вашим ключам. Переключатель сопутствующих в автотаргетинге при этом выключен.</w:t>
       </w:r>
     </w:p>
     <w:p>
-      <w:pPr>
-        <w:pStyle w:val="ListBullet"/>
-        <w:spacing w:after="60"/>
-      </w:pPr>
       <w:r>
         <w:rPr>
           <w:rFonts w:ascii="Calibri" w:hAnsi="Calibri"/>
           <w:sz w:val="22"/>
         </w:rPr>
-        <w:t>Ключ G10 «"рыбалка в черном море"» ловит запрос без города по всему берегу.</w:t>
+        <w:t>Корректировку на 55+ не ставим. Из 107 показов этого возраста 102 пришли из сетей, в поиске их 5. В поиске больше объём у 35–44 лет (23 показа) и 25–34 (13). Конверсий нет ни в одном возрасте, повышать цену конверсии для 55+ не на чем.</w:t>
       </w:r>
     </w:p>
     <w:p>
-      <w:pPr>
-        <w:pStyle w:val="ListBullet"/>
-        <w:spacing w:after="60"/>
-      </w:pPr>
       <w:r>
         <w:rPr>
           <w:rFonts w:ascii="Calibri" w:hAnsi="Calibri"/>
           <w:sz w:val="22"/>
         </w:rPr>
-        <w:t>В G1–G3 по-прежнему нет ключей на ставриду, кефаль и сарган. G5 с этими ключами только на Краснодарский край.</w:t>
-      </w:r>
-    </w:p>
-    <w:p>
-      <w:pPr>
-        <w:pStyle w:val="ListBullet"/>
-        <w:spacing w:after="60"/>
-      </w:pPr>
-      <w:r>
-        <w:rPr>
-          <w:rFonts w:ascii="Calibri" w:hAnsi="Calibri"/>
-          <w:sz w:val="22"/>
-        </w:rPr>
-        <w:t>Интересы G10, если это условие показа, а не наценка, отсекут человека без метки рыбака. В списке есть boatfishing-sochi.ru и rental-yacht.ru.</w:t>
+        <w:t>Минусы к добавлению в кампанию: -камбала, -мацеста, -волнорез, -чебурашка, -акваланг, -баренцев, -ахтуба, -судак, -кмв, -кубань, -форелевая, -развлечения, -прокат, -форум, -альфа. Латинское -kmv запрос «кмв» не закрыло. -аренда не ставить: она погасит ключи аренды в G9. -альфа — если катамаран «Альфа» не ваш.</w:t>
       </w:r>
     </w:p>
     <w:sectPr>
@@ -557,9 +549,6 @@
     <w:name w:val="Normal"/>
     <w:qFormat/>
     <w:rsid w:val="00FC693F"/>
-    <w:pPr>
-      <w:spacing w:after="120"/>
-    </w:pPr>
     <w:rPr>
       <w:rFonts w:ascii="Calibri" w:hAnsi="Calibri" w:eastAsia="Calibri"/>
       <w:sz w:val="22"/>

</xml_diff>